<commit_message>
Add trending-topic questions on memory chips, AI compute and physical AI to the HURA GP script
Co-Authored-By: Claude Fable 5.1 <noreply@anthropic.com>
Claude-Session: https://claude.ai/code/session_012E8sPAnMa4fGqjfkcUXyfP
</commit_message>
<xml_diff>
--- a/interviews/hura-gp-complete.docx
+++ b/interviews/hura-gp-complete.docx
@@ -6172,7 +6172,7 @@
     </w:p>
     <w:bookmarkEnd w:id="62"/>
     <w:bookmarkEnd w:id="63"/>
-    <w:bookmarkStart w:id="71" w:name="script-and-interview-questions-1"/>
+    <w:bookmarkStart w:id="77" w:name="script-and-interview-questions-1"/>
     <w:p>
       <w:pPr>
         <w:pStyle w:val="Heading1"/>
@@ -8851,12 +8851,547 @@
       </w:r>
     </w:p>
     <w:bookmarkEnd w:id="69"/>
-    <w:bookmarkStart w:id="70" w:name="Xc6a41fa27e72abfc3ccf1e6a79f36e9d05c8a9f"/>
+    <w:bookmarkStart w:id="75" w:name="X3ced642a93fc6485107c8059d5d184b9f47073e"/>
     <w:p>
       <w:pPr>
         <w:pStyle w:val="Heading2"/>
       </w:pPr>
       <w:r>
+        <w:t xml:space="preserve">Trending-topic questions: memory chips, AI compute and the hooks of the moment</w:t>
+      </w:r>
+    </w:p>
+    <w:p>
+      <w:pPr>
+        <w:pStyle w:val="FirstParagraph"/>
+      </w:pPr>
+      <w:r>
+        <w:t xml:space="preserve">Memory chips (存储芯片: DRAM, HBM, NAND) are the hottest business story in the world this year, and they are a detour for this company unless each question lands back on their car, their cockpit or their data. So use these as bridges, not as a segment: at most three per sit-down, the memory questions to the CTO and the founder, the rest wherever they fit. A Western viewer who knows nothing about remote racing knows about the RAM shortage and about Nvidia; these questions let them in.</w:t>
+      </w:r>
+    </w:p>
+    <w:p>
+      <w:pPr>
+        <w:pStyle w:val="BodyText"/>
+      </w:pPr>
+      <w:r>
+        <w:rPr>
+          <w:bCs/>
+          <w:b/>
+        </w:rPr>
+        <w:t xml:space="preserve">The facts behind the questions, as reported in October 2026; verify on the day.</w:t>
+      </w:r>
+      <w:r>
+        <w:t xml:space="preserve"> </w:t>
+      </w:r>
+      <w:r>
+        <w:t xml:space="preserve">SK Hynix posted a first-quarter operating margin near 72% and said high-end memory stays tight for about three more years (</w:t>
+      </w:r>
+      <w:hyperlink r:id="rId70">
+        <w:r>
+          <w:rPr>
+            <w:rStyle w:val="Hyperlink"/>
+          </w:rPr>
+          <w:t xml:space="preserve">Korea JoongAng Daily</w:t>
+        </w:r>
+      </w:hyperlink>
+      <w:r>
+        <w:t xml:space="preserve">). Samsung has reportedly raised memory prices by up to 60% since September as AI data centres absorb supply (</w:t>
+      </w:r>
+      <w:hyperlink r:id="rId71">
+        <w:r>
+          <w:rPr>
+            <w:rStyle w:val="Hyperlink"/>
+          </w:rPr>
+          <w:t xml:space="preserve">Tom’s Hardware</w:t>
+        </w:r>
+      </w:hyperlink>
+      <w:r>
+        <w:t xml:space="preserve">). Consumer DDR5 and NAND prices have roughly doubled, and HBM, DRAM and NAND are described as sold out for 2026 (</w:t>
+      </w:r>
+      <w:hyperlink r:id="rId72">
+        <w:r>
+          <w:rPr>
+            <w:rStyle w:val="Hyperlink"/>
+          </w:rPr>
+          <w:t xml:space="preserve">PC Gamer</w:t>
+        </w:r>
+      </w:hyperlink>
+      <w:r>
+        <w:t xml:space="preserve">). CXMT (长鑫) raised about 57.9 billion yuan in its Shanghai listing in July 2026, closed its first day up 466%, and named no HBM project in its prospectus (</w:t>
+      </w:r>
+      <w:hyperlink r:id="rId73">
+        <w:r>
+          <w:rPr>
+            <w:rStyle w:val="Hyperlink"/>
+          </w:rPr>
+          <w:t xml:space="preserve">Tom’s Hardware</w:t>
+        </w:r>
+      </w:hyperlink>
+      <w:r>
+        <w:t xml:space="preserve">). YMTC (长江存储) is reported at about 13% of global NAND and preparing its own IPO (</w:t>
+      </w:r>
+      <w:hyperlink r:id="rId74">
+        <w:r>
+          <w:rPr>
+            <w:rStyle w:val="Hyperlink"/>
+          </w:rPr>
+          <w:t xml:space="preserve">Korea Times</w:t>
+        </w:r>
+      </w:hyperlink>
+      <w:r>
+        <w:t xml:space="preserve">).</w:t>
+      </w:r>
+    </w:p>
+    <w:p>
+      <w:pPr>
+        <w:pStyle w:val="BodyText"/>
+      </w:pPr>
+      <w:r>
+        <w:rPr>
+          <w:bCs/>
+          <w:b/>
+        </w:rPr>
+        <w:t xml:space="preserve">Memory chips, to the CTO.</w:t>
+      </w:r>
+    </w:p>
+    <w:p>
+      <w:pPr>
+        <w:numPr>
+          <w:ilvl w:val="0"/>
+          <w:numId w:val="1024"/>
+        </w:numPr>
+        <w:pStyle w:val="Compact"/>
+      </w:pPr>
+      <w:r>
+        <w:rPr>
+          <w:bCs/>
+          <w:b/>
+        </w:rPr>
+        <w:t xml:space="preserve">The bill of materials.</w:t>
+      </w:r>
+      <w:r>
+        <w:t xml:space="preserve"> </w:t>
+      </w:r>
+      <w:r>
+        <w:t xml:space="preserve">“</w:t>
+      </w:r>
+      <w:r>
+        <w:t xml:space="preserve">Samsung has reportedly raised memory prices by up to 60% since September, and DRAM is sold out for the year. Your cockpits, your edge servers and your Ro-boxes all carry memory. What has the AI boom done to the cost of building one car and one cockpit?</w:t>
+      </w:r>
+      <w:r>
+        <w:t xml:space="preserve">”</w:t>
+      </w:r>
+      <w:r>
+        <w:t xml:space="preserve"> </w:t>
+      </w:r>
+      <w:r>
+        <w:t xml:space="preserve">三星据报道自 9 月以来把存储价格提高了最多 60%，DRAM 今年已经全部售罄。你们的座舱、边缘服务器、Ro-box 都用存储。AI 热潮让造一辆车加一个座舱的成本变了多少？</w:t>
+      </w:r>
+      <w:r>
+        <w:t xml:space="preserve"> </w:t>
+      </w:r>
+      <w:r>
+        <w:t xml:space="preserve">Why: puts the world’s hottest topic on their factory floor. A Western audience understands a bill of materials.</w:t>
+      </w:r>
+    </w:p>
+    <w:p>
+      <w:pPr>
+        <w:numPr>
+          <w:ilvl w:val="0"/>
+          <w:numId w:val="1024"/>
+        </w:numPr>
+        <w:pStyle w:val="Compact"/>
+      </w:pPr>
+      <w:r>
+        <w:rPr>
+          <w:bCs/>
+          <w:b/>
+        </w:rPr>
+        <w:t xml:space="preserve">The queue.</w:t>
+      </w:r>
+      <w:r>
+        <w:t xml:space="preserve"> </w:t>
+      </w:r>
+      <w:r>
+        <w:t xml:space="preserve">“</w:t>
+      </w:r>
+      <w:r>
+        <w:t xml:space="preserve">When SK Hynix and Samsung are selling every chip to Nvidia’s customers, where does a Shanghai sports-technology company stand in the queue? Do you buy Chinese memory, CXMT or YMTC, and does it work?</w:t>
+      </w:r>
+      <w:r>
+        <w:t xml:space="preserve">”</w:t>
+      </w:r>
+      <w:r>
+        <w:t xml:space="preserve"> </w:t>
+      </w:r>
+      <w:r>
+        <w:t xml:space="preserve">当 SK 海力士和三星把每一颗芯片都卖给英伟达的客户时，一家上海的科技体育公司在队伍里排在哪？你们买国产存储吗，长鑫或长江？好用吗？</w:t>
+      </w:r>
+      <w:r>
+        <w:t xml:space="preserve"> </w:t>
+      </w:r>
+      <w:r>
+        <w:t xml:space="preserve">Why: China’s chip self-sufficiency told from a buyer’s seat, which is the version nobody films. CXMT’s 466% debut makes it current.</w:t>
+      </w:r>
+    </w:p>
+    <w:p>
+      <w:pPr>
+        <w:numPr>
+          <w:ilvl w:val="0"/>
+          <w:numId w:val="1024"/>
+        </w:numPr>
+        <w:pStyle w:val="Compact"/>
+      </w:pPr>
+      <w:r>
+        <w:rPr>
+          <w:bCs/>
+          <w:b/>
+        </w:rPr>
+        <w:t xml:space="preserve">The data business meets the storage bill.</w:t>
+      </w:r>
+      <w:r>
+        <w:t xml:space="preserve"> </w:t>
+      </w:r>
+      <w:r>
+        <w:t xml:space="preserve">“</w:t>
+      </w:r>
+      <w:r>
+        <w:t xml:space="preserve">Every race produces synchronised video, control inputs and car state. Storage is exactly the thing that got expensive this year. Is your data a product, or a cost?</w:t>
+      </w:r>
+      <w:r>
+        <w:t xml:space="preserve">”</w:t>
+      </w:r>
+      <w:r>
+        <w:t xml:space="preserve"> </w:t>
+      </w:r>
+      <w:r>
+        <w:t xml:space="preserve">每场比赛都产生同步的视频、控制输入和车辆状态。今年变贵的恰恰是存储。你们的数据是产品，还是成本？</w:t>
+      </w:r>
+      <w:r>
+        <w:t xml:space="preserve"> </w:t>
+      </w:r>
+      <w:r>
+        <w:t xml:space="preserve">Why: ties the embodied-AI data story to the shortage and forces a real answer on unit economics.</w:t>
+      </w:r>
+    </w:p>
+    <w:p>
+      <w:pPr>
+        <w:pStyle w:val="FirstParagraph"/>
+      </w:pPr>
+      <w:r>
+        <w:rPr>
+          <w:bCs/>
+          <w:b/>
+        </w:rPr>
+        <w:t xml:space="preserve">Memory chips, to the founder.</w:t>
+      </w:r>
+    </w:p>
+    <w:p>
+      <w:pPr>
+        <w:numPr>
+          <w:ilvl w:val="0"/>
+          <w:numId w:val="1025"/>
+        </w:numPr>
+        <w:pStyle w:val="Compact"/>
+      </w:pPr>
+      <w:r>
+        <w:rPr>
+          <w:bCs/>
+          <w:b/>
+        </w:rPr>
+        <w:t xml:space="preserve">The three-year squeeze.</w:t>
+      </w:r>
+      <w:r>
+        <w:t xml:space="preserve"> </w:t>
+      </w:r>
+      <w:r>
+        <w:t xml:space="preserve">“</w:t>
+      </w:r>
+      <w:r>
+        <w:t xml:space="preserve">The memory makers say supply stays tight for three more years. If hardware gets dearer every quarter, do you end up owning more cars or fewer, and do drivers start bringing their own cockpits?</w:t>
+      </w:r>
+      <w:r>
+        <w:t xml:space="preserve">”</w:t>
+      </w:r>
+      <w:r>
+        <w:t xml:space="preserve"> </w:t>
+      </w:r>
+      <w:r>
+        <w:t xml:space="preserve">存储厂商说供应还要紧三年。如果硬件每个季度都更贵，你们最后是持有更多车还是更少车？车手会不会开始自带座舱？</w:t>
+      </w:r>
+      <w:r>
+        <w:t xml:space="preserve"> </w:t>
+      </w:r>
+      <w:r>
+        <w:t xml:space="preserve">Why: a strategy question with a visible consequence. The answer reveals whether they go asset-light or asset-heavy.</w:t>
+      </w:r>
+    </w:p>
+    <w:p>
+      <w:pPr>
+        <w:pStyle w:val="FirstParagraph"/>
+      </w:pPr>
+      <w:r>
+        <w:rPr>
+          <w:bCs/>
+          <w:b/>
+        </w:rPr>
+        <w:t xml:space="preserve">AI compute and physical AI, to either.</w:t>
+      </w:r>
+    </w:p>
+    <w:p>
+      <w:pPr>
+        <w:numPr>
+          <w:ilvl w:val="0"/>
+          <w:numId w:val="1026"/>
+        </w:numPr>
+        <w:pStyle w:val="Compact"/>
+      </w:pPr>
+      <w:r>
+        <w:rPr>
+          <w:bCs/>
+          <w:b/>
+        </w:rPr>
+        <w:t xml:space="preserve">Nvidia’s story.</w:t>
+      </w:r>
+      <w:r>
+        <w:t xml:space="preserve"> </w:t>
+      </w:r>
+      <w:r>
+        <w:t xml:space="preserve">“</w:t>
+      </w:r>
+      <w:r>
+        <w:t xml:space="preserve">Nvidia calls this the decade of physical AI, and Jensen Huang says the next wave is robots. Are you a customer of that story or a competitor to it, since your robots have a human inside?</w:t>
+      </w:r>
+      <w:r>
+        <w:t xml:space="preserve">”</w:t>
+      </w:r>
+      <w:r>
+        <w:t xml:space="preserve"> </w:t>
+      </w:r>
+      <w:r>
+        <w:t xml:space="preserve">英伟达把这十年叫作“物理 AI”，黄仁勋说下一波是机器人。你们是这个故事的客户，还是它的竞争者？毕竟你们的机器人里有一个人。</w:t>
+      </w:r>
+      <w:r>
+        <w:t xml:space="preserve"> </w:t>
+      </w:r>
+      <w:r>
+        <w:t xml:space="preserve">Why: a name every Western viewer knows, and it positions them against the autonomy narrative in one answer.</w:t>
+      </w:r>
+    </w:p>
+    <w:p>
+      <w:pPr>
+        <w:numPr>
+          <w:ilvl w:val="0"/>
+          <w:numId w:val="1026"/>
+        </w:numPr>
+        <w:pStyle w:val="Compact"/>
+      </w:pPr>
+      <w:r>
+        <w:rPr>
+          <w:bCs/>
+          <w:b/>
+        </w:rPr>
+        <w:t xml:space="preserve">The DeepSeek move.</w:t>
+      </w:r>
+      <w:r>
+        <w:t xml:space="preserve"> </w:t>
+      </w:r>
+      <w:r>
+        <w:t xml:space="preserve">“</w:t>
+      </w:r>
+      <w:r>
+        <w:t xml:space="preserve">DeepSeek proved China can do more with fewer chips. Is there a DeepSeek move in teleoperation: more with less bandwidth, cheaper hardware, smaller models?</w:t>
+      </w:r>
+      <w:r>
+        <w:t xml:space="preserve">”</w:t>
+      </w:r>
+      <w:r>
+        <w:t xml:space="preserve"> </w:t>
+      </w:r>
+      <w:r>
+        <w:t xml:space="preserve">DeepSeek 证明了中国能用更少的芯片做更多的事。遥操作里有没有一个 DeepSeek 式的做法：更少带宽、更便宜的硬件、更小的模型？</w:t>
+      </w:r>
+      <w:r>
+        <w:t xml:space="preserve"> </w:t>
+      </w:r>
+      <w:r>
+        <w:t xml:space="preserve">Why: the most recognisable China-AI reference in the West; it invites the frugal-engineering story Chinese founders tell well.</w:t>
+      </w:r>
+    </w:p>
+    <w:p>
+      <w:pPr>
+        <w:numPr>
+          <w:ilvl w:val="0"/>
+          <w:numId w:val="1026"/>
+        </w:numPr>
+        <w:pStyle w:val="Compact"/>
+      </w:pPr>
+      <w:r>
+        <w:rPr>
+          <w:bCs/>
+          <w:b/>
+        </w:rPr>
+        <w:t xml:space="preserve">Humanoid season.</w:t>
+      </w:r>
+      <w:r>
+        <w:t xml:space="preserve"> </w:t>
+      </w:r>
+      <w:r>
+        <w:t xml:space="preserve">“</w:t>
+      </w:r>
+      <w:r>
+        <w:t xml:space="preserve">Unitree is listed, and Beijing ran 666 teams of humanoids in August. Which humanoid will be on your track first, and will it be driven from another country?</w:t>
+      </w:r>
+      <w:r>
+        <w:t xml:space="preserve">”</w:t>
+      </w:r>
+      <w:r>
+        <w:t xml:space="preserve"> </w:t>
+      </w:r>
+      <w:r>
+        <w:t xml:space="preserve">宇树上市了，北京 8 月办了 666 支队伍的人形机器人运动会。哪家的人形机器人会先出现在你们的赛道上？会从另一个国家操控吗？</w:t>
+      </w:r>
+      <w:r>
+        <w:t xml:space="preserve"> </w:t>
+      </w:r>
+      <w:r>
+        <w:t xml:space="preserve">Why: dated and concrete. Confirm Unitree’s listing status on the day; it was widely reported as in process in 2026.</w:t>
+      </w:r>
+    </w:p>
+    <w:p>
+      <w:pPr>
+        <w:numPr>
+          <w:ilvl w:val="0"/>
+          <w:numId w:val="1026"/>
+        </w:numPr>
+        <w:pStyle w:val="Compact"/>
+      </w:pPr>
+      <w:r>
+        <w:rPr>
+          <w:bCs/>
+          <w:b/>
+        </w:rPr>
+        <w:t xml:space="preserve">The box and the border.</w:t>
+      </w:r>
+      <w:r>
+        <w:t xml:space="preserve"> </w:t>
+      </w:r>
+      <w:r>
+        <w:t xml:space="preserve">“</w:t>
+      </w:r>
+      <w:r>
+        <w:t xml:space="preserve">Chips are the front line of the US-China contest. Is there anything in your box you could not buy tomorrow if the rules changed, and what would you do?</w:t>
+      </w:r>
+      <w:r>
+        <w:t xml:space="preserve">”</w:t>
+      </w:r>
+      <w:r>
+        <w:t xml:space="preserve"> </w:t>
+      </w:r>
+      <w:r>
+        <w:t xml:space="preserve">芯片是中美竞争的前线。你们盒子里有没有哪个东西明天规则一变就买不到？那你们怎么办？</w:t>
+      </w:r>
+      <w:r>
+        <w:t xml:space="preserve"> </w:t>
+      </w:r>
+      <w:r>
+        <w:t xml:space="preserve">Why: the geopolitical question asked as an engineering question, which keeps it answerable and keeps them comfortable.</w:t>
+      </w:r>
+    </w:p>
+    <w:p>
+      <w:pPr>
+        <w:numPr>
+          <w:ilvl w:val="0"/>
+          <w:numId w:val="1026"/>
+        </w:numPr>
+        <w:pStyle w:val="Compact"/>
+      </w:pPr>
+      <w:r>
+        <w:rPr>
+          <w:bCs/>
+          <w:b/>
+        </w:rPr>
+        <w:t xml:space="preserve">What 5G was for.</w:t>
+      </w:r>
+      <w:r>
+        <w:t xml:space="preserve"> </w:t>
+      </w:r>
+      <w:r>
+        <w:t xml:space="preserve">“</w:t>
+      </w:r>
+      <w:r>
+        <w:t xml:space="preserve">China Mobile is selling 5G-A now. Do you need it, or is this the first use case that makes an ordinary person feel why 5G existed?</w:t>
+      </w:r>
+      <w:r>
+        <w:t xml:space="preserve">”</w:t>
+      </w:r>
+      <w:r>
+        <w:t xml:space="preserve"> </w:t>
+      </w:r>
+      <w:r>
+        <w:t xml:space="preserve">中国移动在推 5G-A。你们需要它吗？还是说这是第一个让普通人感受到 5G 为什么存在的应用？</w:t>
+      </w:r>
+      <w:r>
+        <w:t xml:space="preserve"> </w:t>
+      </w:r>
+      <w:r>
+        <w:t xml:space="preserve">Why: the telecom hook, and the line an Ericsson engineer will quote.</w:t>
+      </w:r>
+    </w:p>
+    <w:p>
+      <w:pPr>
+        <w:pStyle w:val="FirstParagraph"/>
+      </w:pPr>
+      <w:r>
+        <w:rPr>
+          <w:bCs/>
+          <w:b/>
+        </w:rPr>
+        <w:t xml:space="preserve">Rapid-fire additions.</w:t>
+      </w:r>
+    </w:p>
+    <w:p>
+      <w:pPr>
+        <w:numPr>
+          <w:ilvl w:val="0"/>
+          <w:numId w:val="1027"/>
+        </w:numPr>
+        <w:pStyle w:val="Compact"/>
+      </w:pPr>
+      <w:r>
+        <w:t xml:space="preserve">Nvidia or Huawei: whose chips are in the box? 英伟达还是华为：盒子里是谁的芯片？</w:t>
+      </w:r>
+    </w:p>
+    <w:p>
+      <w:pPr>
+        <w:numPr>
+          <w:ilvl w:val="0"/>
+          <w:numId w:val="1027"/>
+        </w:numPr>
+        <w:pStyle w:val="Compact"/>
+      </w:pPr>
+      <w:r>
+        <w:t xml:space="preserve">If DRAM doubles again, what do you cut first? 如果 DRAM 再涨一倍，你先砍什么？</w:t>
+      </w:r>
+    </w:p>
+    <w:p>
+      <w:pPr>
+        <w:numPr>
+          <w:ilvl w:val="0"/>
+          <w:numId w:val="1027"/>
+        </w:numPr>
+        <w:pStyle w:val="Compact"/>
+      </w:pPr>
+      <w:r>
+        <w:t xml:space="preserve">The memory shortage, in one word. 用一个词形容存储短缺。</w:t>
+      </w:r>
+    </w:p>
+    <w:bookmarkEnd w:id="75"/>
+    <w:bookmarkStart w:id="76" w:name="Xc6a41fa27e72abfc3ccf1e6a79f36e9d05c8a9f"/>
+    <w:p>
+      <w:pPr>
+        <w:pStyle w:val="Heading2"/>
+      </w:pPr>
+      <w:r>
         <w:t xml:space="preserve">Rapid-fire, closers, and the lines you must get</w:t>
       </w:r>
     </w:p>
@@ -8900,7 +9435,7 @@
       <w:pPr>
         <w:numPr>
           <w:ilvl w:val="0"/>
-          <w:numId w:val="1024"/>
+          <w:numId w:val="1028"/>
         </w:numPr>
         <w:pStyle w:val="Compact"/>
       </w:pPr>
@@ -8912,7 +9447,7 @@
       <w:pPr>
         <w:numPr>
           <w:ilvl w:val="0"/>
-          <w:numId w:val="1024"/>
+          <w:numId w:val="1028"/>
         </w:numPr>
         <w:pStyle w:val="Compact"/>
       </w:pPr>
@@ -8924,7 +9459,7 @@
       <w:pPr>
         <w:numPr>
           <w:ilvl w:val="0"/>
-          <w:numId w:val="1024"/>
+          <w:numId w:val="1028"/>
         </w:numPr>
         <w:pStyle w:val="Compact"/>
       </w:pPr>
@@ -8936,7 +9471,7 @@
       <w:pPr>
         <w:numPr>
           <w:ilvl w:val="0"/>
-          <w:numId w:val="1024"/>
+          <w:numId w:val="1028"/>
         </w:numPr>
         <w:pStyle w:val="Compact"/>
       </w:pPr>
@@ -8948,7 +9483,7 @@
       <w:pPr>
         <w:numPr>
           <w:ilvl w:val="0"/>
-          <w:numId w:val="1024"/>
+          <w:numId w:val="1028"/>
         </w:numPr>
         <w:pStyle w:val="Compact"/>
       </w:pPr>
@@ -8960,7 +9495,7 @@
       <w:pPr>
         <w:numPr>
           <w:ilvl w:val="0"/>
-          <w:numId w:val="1024"/>
+          <w:numId w:val="1028"/>
         </w:numPr>
         <w:pStyle w:val="Compact"/>
       </w:pPr>
@@ -8972,7 +9507,7 @@
       <w:pPr>
         <w:numPr>
           <w:ilvl w:val="0"/>
-          <w:numId w:val="1024"/>
+          <w:numId w:val="1028"/>
         </w:numPr>
         <w:pStyle w:val="Compact"/>
       </w:pPr>
@@ -9011,7 +9546,7 @@
       <w:pPr>
         <w:numPr>
           <w:ilvl w:val="0"/>
-          <w:numId w:val="1024"/>
+          <w:numId w:val="1028"/>
         </w:numPr>
         <w:pStyle w:val="Compact"/>
       </w:pPr>
@@ -9023,7 +9558,7 @@
       <w:pPr>
         <w:numPr>
           <w:ilvl w:val="0"/>
-          <w:numId w:val="1024"/>
+          <w:numId w:val="1028"/>
         </w:numPr>
         <w:pStyle w:val="Compact"/>
       </w:pPr>
@@ -9047,7 +9582,7 @@
       <w:pPr>
         <w:numPr>
           <w:ilvl w:val="0"/>
-          <w:numId w:val="1025"/>
+          <w:numId w:val="1029"/>
         </w:numPr>
         <w:pStyle w:val="Compact"/>
       </w:pPr>
@@ -9077,7 +9612,7 @@
       <w:pPr>
         <w:numPr>
           <w:ilvl w:val="0"/>
-          <w:numId w:val="1025"/>
+          <w:numId w:val="1029"/>
         </w:numPr>
         <w:pStyle w:val="Compact"/>
       </w:pPr>
@@ -9107,7 +9642,7 @@
       <w:pPr>
         <w:numPr>
           <w:ilvl w:val="0"/>
-          <w:numId w:val="1025"/>
+          <w:numId w:val="1029"/>
         </w:numPr>
         <w:pStyle w:val="Compact"/>
       </w:pPr>
@@ -9137,7 +9672,7 @@
       <w:pPr>
         <w:numPr>
           <w:ilvl w:val="0"/>
-          <w:numId w:val="1025"/>
+          <w:numId w:val="1029"/>
         </w:numPr>
         <w:pStyle w:val="Compact"/>
       </w:pPr>
@@ -9185,7 +9720,7 @@
       <w:pPr>
         <w:numPr>
           <w:ilvl w:val="0"/>
-          <w:numId w:val="1026"/>
+          <w:numId w:val="1030"/>
         </w:numPr>
         <w:pStyle w:val="Compact"/>
       </w:pPr>
@@ -9197,7 +9732,7 @@
       <w:pPr>
         <w:numPr>
           <w:ilvl w:val="0"/>
-          <w:numId w:val="1026"/>
+          <w:numId w:val="1030"/>
         </w:numPr>
         <w:pStyle w:val="Compact"/>
       </w:pPr>
@@ -9209,7 +9744,7 @@
       <w:pPr>
         <w:numPr>
           <w:ilvl w:val="0"/>
-          <w:numId w:val="1026"/>
+          <w:numId w:val="1030"/>
         </w:numPr>
         <w:pStyle w:val="Compact"/>
       </w:pPr>
@@ -9221,7 +9756,7 @@
       <w:pPr>
         <w:numPr>
           <w:ilvl w:val="0"/>
-          <w:numId w:val="1026"/>
+          <w:numId w:val="1030"/>
         </w:numPr>
         <w:pStyle w:val="Compact"/>
       </w:pPr>
@@ -9233,7 +9768,7 @@
       <w:pPr>
         <w:numPr>
           <w:ilvl w:val="0"/>
-          <w:numId w:val="1026"/>
+          <w:numId w:val="1030"/>
         </w:numPr>
         <w:pStyle w:val="Compact"/>
       </w:pPr>
@@ -9245,7 +9780,7 @@
       <w:pPr>
         <w:numPr>
           <w:ilvl w:val="0"/>
-          <w:numId w:val="1026"/>
+          <w:numId w:val="1030"/>
         </w:numPr>
         <w:pStyle w:val="Compact"/>
       </w:pPr>
@@ -9257,7 +9792,7 @@
       <w:pPr>
         <w:numPr>
           <w:ilvl w:val="0"/>
-          <w:numId w:val="1026"/>
+          <w:numId w:val="1030"/>
         </w:numPr>
         <w:pStyle w:val="Compact"/>
       </w:pPr>
@@ -9269,7 +9804,7 @@
       <w:pPr>
         <w:numPr>
           <w:ilvl w:val="0"/>
-          <w:numId w:val="1026"/>
+          <w:numId w:val="1030"/>
         </w:numPr>
         <w:pStyle w:val="Compact"/>
       </w:pPr>
@@ -9299,7 +9834,7 @@
       <w:pPr>
         <w:numPr>
           <w:ilvl w:val="0"/>
-          <w:numId w:val="1026"/>
+          <w:numId w:val="1030"/>
         </w:numPr>
         <w:pStyle w:val="Compact"/>
       </w:pPr>
@@ -9325,8 +9860,8 @@
         <w:t xml:space="preserve">Ask, in this order: origin with a failure (1), one sentence two audiences (2), the crash (4), fairness (5), the sceptic (12), the novelty closer. Six questions, ten minutes, enough for a cut.</w:t>
       </w:r>
     </w:p>
-    <w:bookmarkEnd w:id="70"/>
-    <w:bookmarkEnd w:id="71"/>
+    <w:bookmarkEnd w:id="76"/>
+    <w:bookmarkEnd w:id="77"/>
     <w:sectPr/>
   </w:body>
 </w:document>
@@ -9588,6 +10123,176 @@
     <w:lvl w:ilvl="8">
       <w:numFmt w:val="bullet"/>
       <w:lvlText w:val="•"/>
+      <w:lvlJc w:val="left"/>
+      <w:pPr>
+        <w:ind w:left="6480" w:hanging="480"/>
+      </w:pPr>
+    </w:lvl>
+  </w:abstractNum>
+  <w:abstractNum w:abstractNumId="99414">
+    <w:nsid w:val="A99414"/>
+    <w:multiLevelType w:val="multilevel"/>
+    <w:lvl w:ilvl="0">
+      <w:start w:val="4"/>
+      <w:numFmt w:val="decimal"/>
+      <w:lvlText w:val="%1."/>
+      <w:lvlJc w:val="left"/>
+      <w:pPr>
+        <w:ind w:left="720" w:hanging="480"/>
+      </w:pPr>
+    </w:lvl>
+    <w:lvl w:ilvl="1">
+      <w:start w:val="4"/>
+      <w:numFmt w:val="decimal"/>
+      <w:lvlText w:val="%2."/>
+      <w:lvlJc w:val="left"/>
+      <w:pPr>
+        <w:ind w:left="1440" w:hanging="480"/>
+      </w:pPr>
+    </w:lvl>
+    <w:lvl w:ilvl="2">
+      <w:start w:val="4"/>
+      <w:numFmt w:val="decimal"/>
+      <w:lvlText w:val="%3."/>
+      <w:lvlJc w:val="left"/>
+      <w:pPr>
+        <w:ind w:left="2160" w:hanging="480"/>
+      </w:pPr>
+    </w:lvl>
+    <w:lvl w:ilvl="3">
+      <w:start w:val="4"/>
+      <w:numFmt w:val="decimal"/>
+      <w:lvlText w:val="%4."/>
+      <w:lvlJc w:val="left"/>
+      <w:pPr>
+        <w:ind w:left="2880" w:hanging="480"/>
+      </w:pPr>
+    </w:lvl>
+    <w:lvl w:ilvl="4">
+      <w:start w:val="4"/>
+      <w:numFmt w:val="decimal"/>
+      <w:lvlText w:val="%5."/>
+      <w:lvlJc w:val="left"/>
+      <w:pPr>
+        <w:ind w:left="3600" w:hanging="480"/>
+      </w:pPr>
+    </w:lvl>
+    <w:lvl w:ilvl="5">
+      <w:start w:val="4"/>
+      <w:numFmt w:val="decimal"/>
+      <w:lvlText w:val="%6."/>
+      <w:lvlJc w:val="left"/>
+      <w:pPr>
+        <w:ind w:left="4320" w:hanging="480"/>
+      </w:pPr>
+    </w:lvl>
+    <w:lvl w:ilvl="6">
+      <w:start w:val="4"/>
+      <w:numFmt w:val="decimal"/>
+      <w:lvlText w:val="%7."/>
+      <w:lvlJc w:val="left"/>
+      <w:pPr>
+        <w:ind w:left="5040" w:hanging="480"/>
+      </w:pPr>
+    </w:lvl>
+    <w:lvl w:ilvl="7">
+      <w:start w:val="4"/>
+      <w:numFmt w:val="decimal"/>
+      <w:lvlText w:val="%8."/>
+      <w:lvlJc w:val="left"/>
+      <w:pPr>
+        <w:ind w:left="5760" w:hanging="480"/>
+      </w:pPr>
+    </w:lvl>
+    <w:lvl w:ilvl="8">
+      <w:start w:val="4"/>
+      <w:numFmt w:val="decimal"/>
+      <w:lvlText w:val="%9."/>
+      <w:lvlJc w:val="left"/>
+      <w:pPr>
+        <w:ind w:left="6480" w:hanging="480"/>
+      </w:pPr>
+    </w:lvl>
+  </w:abstractNum>
+  <w:abstractNum w:abstractNumId="99415">
+    <w:nsid w:val="A99415"/>
+    <w:multiLevelType w:val="multilevel"/>
+    <w:lvl w:ilvl="0">
+      <w:start w:val="5"/>
+      <w:numFmt w:val="decimal"/>
+      <w:lvlText w:val="%1."/>
+      <w:lvlJc w:val="left"/>
+      <w:pPr>
+        <w:ind w:left="720" w:hanging="480"/>
+      </w:pPr>
+    </w:lvl>
+    <w:lvl w:ilvl="1">
+      <w:start w:val="5"/>
+      <w:numFmt w:val="decimal"/>
+      <w:lvlText w:val="%2."/>
+      <w:lvlJc w:val="left"/>
+      <w:pPr>
+        <w:ind w:left="1440" w:hanging="480"/>
+      </w:pPr>
+    </w:lvl>
+    <w:lvl w:ilvl="2">
+      <w:start w:val="5"/>
+      <w:numFmt w:val="decimal"/>
+      <w:lvlText w:val="%3."/>
+      <w:lvlJc w:val="left"/>
+      <w:pPr>
+        <w:ind w:left="2160" w:hanging="480"/>
+      </w:pPr>
+    </w:lvl>
+    <w:lvl w:ilvl="3">
+      <w:start w:val="5"/>
+      <w:numFmt w:val="decimal"/>
+      <w:lvlText w:val="%4."/>
+      <w:lvlJc w:val="left"/>
+      <w:pPr>
+        <w:ind w:left="2880" w:hanging="480"/>
+      </w:pPr>
+    </w:lvl>
+    <w:lvl w:ilvl="4">
+      <w:start w:val="5"/>
+      <w:numFmt w:val="decimal"/>
+      <w:lvlText w:val="%5."/>
+      <w:lvlJc w:val="left"/>
+      <w:pPr>
+        <w:ind w:left="3600" w:hanging="480"/>
+      </w:pPr>
+    </w:lvl>
+    <w:lvl w:ilvl="5">
+      <w:start w:val="5"/>
+      <w:numFmt w:val="decimal"/>
+      <w:lvlText w:val="%6."/>
+      <w:lvlJc w:val="left"/>
+      <w:pPr>
+        <w:ind w:left="4320" w:hanging="480"/>
+      </w:pPr>
+    </w:lvl>
+    <w:lvl w:ilvl="6">
+      <w:start w:val="5"/>
+      <w:numFmt w:val="decimal"/>
+      <w:lvlText w:val="%7."/>
+      <w:lvlJc w:val="left"/>
+      <w:pPr>
+        <w:ind w:left="5040" w:hanging="480"/>
+      </w:pPr>
+    </w:lvl>
+    <w:lvl w:ilvl="7">
+      <w:start w:val="5"/>
+      <w:numFmt w:val="decimal"/>
+      <w:lvlText w:val="%8."/>
+      <w:lvlJc w:val="left"/>
+      <w:pPr>
+        <w:ind w:left="5760" w:hanging="480"/>
+      </w:pPr>
+    </w:lvl>
+    <w:lvl w:ilvl="8">
+      <w:start w:val="5"/>
+      <w:numFmt w:val="decimal"/>
+      <w:lvlText w:val="%9."/>
       <w:lvlJc w:val="left"/>
       <w:pPr>
         <w:ind w:left="6480" w:hanging="480"/>
@@ -9937,12 +10642,105 @@
     </w:lvlOverride>
   </w:num>
   <w:num w:numId="1024">
+    <w:abstractNumId w:val="99411"/>
+    <w:lvlOverride w:ilvl="0">
+      <w:startOverride w:val="1"/>
+    </w:lvlOverride>
+    <w:lvlOverride w:ilvl="1">
+      <w:startOverride w:val="1"/>
+    </w:lvlOverride>
+    <w:lvlOverride w:ilvl="2">
+      <w:startOverride w:val="1"/>
+    </w:lvlOverride>
+    <w:lvlOverride w:ilvl="3">
+      <w:startOverride w:val="1"/>
+    </w:lvlOverride>
+    <w:lvlOverride w:ilvl="4">
+      <w:startOverride w:val="1"/>
+    </w:lvlOverride>
+    <w:lvlOverride w:ilvl="5">
+      <w:startOverride w:val="1"/>
+    </w:lvlOverride>
+    <w:lvlOverride w:ilvl="6">
+      <w:startOverride w:val="1"/>
+    </w:lvlOverride>
+    <w:lvlOverride w:ilvl="7">
+      <w:startOverride w:val="1"/>
+    </w:lvlOverride>
+    <w:lvlOverride w:ilvl="8">
+      <w:startOverride w:val="1"/>
+    </w:lvlOverride>
+  </w:num>
+  <w:num w:numId="1025">
+    <w:abstractNumId w:val="99414"/>
+    <w:lvlOverride w:ilvl="0">
+      <w:startOverride w:val="4"/>
+    </w:lvlOverride>
+    <w:lvlOverride w:ilvl="1">
+      <w:startOverride w:val="4"/>
+    </w:lvlOverride>
+    <w:lvlOverride w:ilvl="2">
+      <w:startOverride w:val="4"/>
+    </w:lvlOverride>
+    <w:lvlOverride w:ilvl="3">
+      <w:startOverride w:val="4"/>
+    </w:lvlOverride>
+    <w:lvlOverride w:ilvl="4">
+      <w:startOverride w:val="4"/>
+    </w:lvlOverride>
+    <w:lvlOverride w:ilvl="5">
+      <w:startOverride w:val="4"/>
+    </w:lvlOverride>
+    <w:lvlOverride w:ilvl="6">
+      <w:startOverride w:val="4"/>
+    </w:lvlOverride>
+    <w:lvlOverride w:ilvl="7">
+      <w:startOverride w:val="4"/>
+    </w:lvlOverride>
+    <w:lvlOverride w:ilvl="8">
+      <w:startOverride w:val="4"/>
+    </w:lvlOverride>
+  </w:num>
+  <w:num w:numId="1026">
+    <w:abstractNumId w:val="99415"/>
+    <w:lvlOverride w:ilvl="0">
+      <w:startOverride w:val="5"/>
+    </w:lvlOverride>
+    <w:lvlOverride w:ilvl="1">
+      <w:startOverride w:val="5"/>
+    </w:lvlOverride>
+    <w:lvlOverride w:ilvl="2">
+      <w:startOverride w:val="5"/>
+    </w:lvlOverride>
+    <w:lvlOverride w:ilvl="3">
+      <w:startOverride w:val="5"/>
+    </w:lvlOverride>
+    <w:lvlOverride w:ilvl="4">
+      <w:startOverride w:val="5"/>
+    </w:lvlOverride>
+    <w:lvlOverride w:ilvl="5">
+      <w:startOverride w:val="5"/>
+    </w:lvlOverride>
+    <w:lvlOverride w:ilvl="6">
+      <w:startOverride w:val="5"/>
+    </w:lvlOverride>
+    <w:lvlOverride w:ilvl="7">
+      <w:startOverride w:val="5"/>
+    </w:lvlOverride>
+    <w:lvlOverride w:ilvl="8">
+      <w:startOverride w:val="5"/>
+    </w:lvlOverride>
+  </w:num>
+  <w:num w:numId="1027">
     <w:abstractNumId w:val="991"/>
   </w:num>
-  <w:num w:numId="1025">
+  <w:num w:numId="1028">
     <w:abstractNumId w:val="991"/>
   </w:num>
-  <w:num w:numId="1026">
+  <w:num w:numId="1029">
+    <w:abstractNumId w:val="991"/>
+  </w:num>
+  <w:num w:numId="1030">
     <w:abstractNumId w:val="991"/>
   </w:num>
 </w:numbering>

</xml_diff>

<commit_message>
Rewrite the read-aloud script in the timed, ranked order with hooks and follow-ups
Co-Authored-By: Claude Fable 5.1 <noreply@anthropic.com>
Claude-Session: https://claude.ai/code/session_012E8sPAnMa4fGqjfkcUXyfP
</commit_message>
<xml_diff>
--- a/interviews/hura-gp-complete.docx
+++ b/interviews/hura-gp-complete.docx
@@ -13061,7 +13061,7 @@
     </w:p>
     <w:bookmarkEnd w:id="83"/>
     <w:bookmarkEnd w:id="84"/>
-    <w:bookmarkStart w:id="103" w:name="read-aloud-script"/>
+    <w:bookmarkStart w:id="126" w:name="read-aloud-script"/>
     <w:p>
       <w:pPr>
         <w:pStyle w:val="Heading1"/>
@@ -13075,16 +13075,25 @@
         <w:pStyle w:val="FirstParagraph"/>
       </w:pPr>
       <w:r>
-        <w:t xml:space="preserve">Everything below is what you say, in order, and nothing else. Read it out loud. Narration should land at about 150 words a minute; questions slower, with a pause before the last word.</w:t>
-      </w:r>
-    </w:p>
-    <w:bookmarkStart w:id="85" w:name="cold-open-voice-over"/>
+        <w:t xml:space="preserve">Every line below is a line you say, in the order you say it. Nothing else is on the page. Headings and minute marks are for your eye only; do not read them. Narration at about 150 words a minute, questions slower, and a full stop of silence after each question.</w:t>
+      </w:r>
+    </w:p>
+    <w:bookmarkStart w:id="89" w:name="narration-part-1"/>
     <w:p>
       <w:pPr>
         <w:pStyle w:val="Heading2"/>
       </w:pPr>
       <w:r>
-        <w:t xml:space="preserve">1. Cold open, voice-over</w:t>
+        <w:t xml:space="preserve">Narration, part 1</w:t>
+      </w:r>
+    </w:p>
+    <w:bookmarkStart w:id="85" w:name="cold-open"/>
+    <w:p>
+      <w:pPr>
+        <w:pStyle w:val="Heading3"/>
+      </w:pPr>
+      <w:r>
+        <w:t xml:space="preserve">Cold open</w:t>
       </w:r>
     </w:p>
     <w:p>
@@ -13104,13 +13113,13 @@
       </w:r>
     </w:p>
     <w:bookmarkEnd w:id="85"/>
-    <w:bookmarkStart w:id="86" w:name="stakes-voice-over"/>
-    <w:p>
-      <w:pPr>
-        <w:pStyle w:val="Heading2"/>
-      </w:pPr>
-      <w:r>
-        <w:t xml:space="preserve">2. Stakes, voice-over</w:t>
+    <w:bookmarkStart w:id="86" w:name="stakes"/>
+    <w:p>
+      <w:pPr>
+        <w:pStyle w:val="Heading3"/>
+      </w:pPr>
+      <w:r>
+        <w:t xml:space="preserve">Stakes</w:t>
       </w:r>
     </w:p>
     <w:p>
@@ -13125,10 +13134,56 @@
     <w:bookmarkStart w:id="87" w:name="piece-to-camera-beside-the-cockpit"/>
     <w:p>
       <w:pPr>
+        <w:pStyle w:val="Heading3"/>
+      </w:pPr>
+      <w:r>
+        <w:t xml:space="preserve">Piece to camera, beside the cockpit</w:t>
+      </w:r>
+    </w:p>
+    <w:p>
+      <w:pPr>
+        <w:pStyle w:val="FirstParagraph"/>
+      </w:pPr>
+      <w:r>
+        <w:t xml:space="preserve">I used to build the box that connects a car to the network. The T-box. It phones home, updates the software, unlocks the doors. What they have built is the same box pointed the other way: instead of the car talking to the cloud, a human in the cloud drives the car. The question is how many milliseconds that costs, and whether a human can live with it. I am about to find out.</w:t>
+      </w:r>
+    </w:p>
+    <w:bookmarkEnd w:id="87"/>
+    <w:bookmarkStart w:id="88" w:name="bridge-to-the-founder"/>
+    <w:p>
+      <w:pPr>
+        <w:pStyle w:val="Heading3"/>
+      </w:pPr>
+      <w:r>
+        <w:t xml:space="preserve">Bridge to the founder</w:t>
+      </w:r>
+    </w:p>
+    <w:p>
+      <w:pPr>
+        <w:pStyle w:val="FirstParagraph"/>
+      </w:pPr>
+      <w:r>
+        <w:t xml:space="preserve">In March, during the Formula 1 weekend, they ran their first season final a few hundred metres from the real circuit. The cars were on this track. The drivers were ten kilometres away. [The winner’s name] won by [margin], which is less than the time it takes the video to reach his screen.</w:t>
+      </w:r>
+    </w:p>
+    <w:bookmarkEnd w:id="88"/>
+    <w:bookmarkEnd w:id="89"/>
+    <w:bookmarkStart w:id="97" w:name="founder-20-minutes-1"/>
+    <w:p>
+      <w:pPr>
         <w:pStyle w:val="Heading2"/>
       </w:pPr>
       <w:r>
-        <w:t xml:space="preserve">3. Piece to camera, beside the cockpit</w:t>
+        <w:t xml:space="preserve">Founder, 20 minutes</w:t>
+      </w:r>
+    </w:p>
+    <w:bookmarkStart w:id="90" w:name="before-the-camera-rolls"/>
+    <w:p>
+      <w:pPr>
+        <w:pStyle w:val="Heading3"/>
+      </w:pPr>
+      <w:r>
+        <w:t xml:space="preserve">Before the camera rolls</w:t>
       </w:r>
     </w:p>
     <w:p>
@@ -13136,17 +13191,247 @@
         <w:pStyle w:val="FirstParagraph"/>
       </w:pPr>
       <w:r>
-        <w:t xml:space="preserve">I used to build the box that connects a car to the network. The T-box. It phones home, updates the software, unlocks the doors. What they have built is the same box pointed the other way: instead of the car talking to the cloud, a human in the cloud drives the car. The question is how many milliseconds that costs, and whether a human can live with it. I am about to find out.</w:t>
-      </w:r>
-    </w:p>
-    <w:bookmarkEnd w:id="87"/>
-    <w:bookmarkStart w:id="88" w:name="bridge-to-the-founder-voice-over"/>
+        <w:t xml:space="preserve">I run a Chinese-founded studio in Sweden with a Western audience. I want this to be the film a European investor or an Ericsson engineer watches to understand what you have actually built, not the hype version. The sceptic’s question stays in; that is what makes the rest believable.</w:t>
+      </w:r>
+    </w:p>
+    <w:bookmarkEnd w:id="90"/>
+    <w:bookmarkStart w:id="91" w:name="a.-origin-and-definition-0-to-4"/>
+    <w:p>
+      <w:pPr>
+        <w:pStyle w:val="Heading3"/>
+      </w:pPr>
+      <w:r>
+        <w:t xml:space="preserve">A. Origin and definition, 0 to 4</w:t>
+      </w:r>
+    </w:p>
+    <w:p>
+      <w:pPr>
+        <w:pStyle w:val="FirstParagraph"/>
+      </w:pPr>
+      <w:r>
+        <w:t xml:space="preserve">Tell me about the first time someone drove one of your cars from another city. Where were you standing, and what went wrong?</w:t>
+      </w:r>
+    </w:p>
+    <w:p>
+      <w:pPr>
+        <w:pStyle w:val="BodyText"/>
+      </w:pPr>
+      <w:r>
+        <w:t xml:space="preserve">And then what happened?</w:t>
+      </w:r>
+    </w:p>
+    <w:p>
+      <w:pPr>
+        <w:pStyle w:val="BodyText"/>
+      </w:pPr>
+      <w:r>
+        <w:t xml:space="preserve">If I am a Formula 1 fan in London, what is HURA GP in one sentence? And if I am an esports fan in Seoul?</w:t>
+      </w:r>
+    </w:p>
+    <w:bookmarkEnd w:id="91"/>
+    <w:bookmarkStart w:id="92" w:name="b.-stakes-and-fairness-4-to-8"/>
+    <w:p>
+      <w:pPr>
+        <w:pStyle w:val="Heading3"/>
+      </w:pPr>
+      <w:r>
+        <w:t xml:space="preserve">B. Stakes and fairness, 4 to 8</w:t>
+      </w:r>
+    </w:p>
+    <w:p>
+      <w:pPr>
+        <w:pStyle w:val="FirstParagraph"/>
+      </w:pPr>
+      <w:r>
+        <w:t xml:space="preserve">In a racing game, nothing is real. Here the crash is real and the driver still only sees a screen.</w:t>
+      </w:r>
+    </w:p>
+    <w:p>
+      <w:pPr>
+        <w:pStyle w:val="BodyText"/>
+      </w:pPr>
+      <w:r>
+        <w:t xml:space="preserve">What happens when a car crashes? Who pays, who fixes it, and does the driver see it?</w:t>
+      </w:r>
+    </w:p>
+    <w:p>
+      <w:pPr>
+        <w:pStyle w:val="BodyText"/>
+      </w:pPr>
+      <w:r>
+        <w:t xml:space="preserve">Two drivers, one in Shanghai and one in Chengdu. The Chengdu driver has forty milliseconds more delay. Is that fair? What do you do about it?</w:t>
+      </w:r>
+    </w:p>
+    <w:p>
+      <w:pPr>
+        <w:pStyle w:val="BodyText"/>
+      </w:pPr>
+      <w:r>
+        <w:t xml:space="preserve">Would you slow the faster link down on purpose?</w:t>
+      </w:r>
+    </w:p>
+    <w:bookmarkEnd w:id="92"/>
+    <w:bookmarkStart w:id="93" w:name="c.-the-world-8-to-12"/>
+    <w:p>
+      <w:pPr>
+        <w:pStyle w:val="Heading3"/>
+      </w:pPr>
+      <w:r>
+        <w:t xml:space="preserve">C. The world, 8 to 12</w:t>
+      </w:r>
+    </w:p>
+    <w:p>
+      <w:pPr>
+        <w:pStyle w:val="FirstParagraph"/>
+      </w:pPr>
+      <w:r>
+        <w:t xml:space="preserve">Finland tried this in 2019 and the company folded. Abu Dhabi races cars with no driver at all. You are the only ones doing it with a crowd watching.</w:t>
+      </w:r>
+    </w:p>
+    <w:p>
+      <w:pPr>
+        <w:pStyle w:val="BodyText"/>
+      </w:pPr>
+      <w:r>
+        <w:t xml:space="preserve">If a driver in Stockholm wanted to race in your next final, what would you need: technically, legally, commercially?</w:t>
+      </w:r>
+    </w:p>
+    <w:p>
+      <w:pPr>
+        <w:pStyle w:val="BodyText"/>
+      </w:pPr>
+      <w:r>
+        <w:t xml:space="preserve">A sceptic in Europe will say: it is RC cars with a 5G sticker. What is your answer?</w:t>
+      </w:r>
+    </w:p>
+    <w:p>
+      <w:pPr>
+        <w:pStyle w:val="BodyText"/>
+      </w:pPr>
+      <w:r>
+        <w:t xml:space="preserve">Is this esports, motorsport, or something that does not have a name yet? Who do you want to sanction you, the esports federations or the motorsport bodies?</w:t>
+      </w:r>
+    </w:p>
+    <w:bookmarkEnd w:id="93"/>
+    <w:bookmarkStart w:id="94" w:name="d.-robots-and-the-bet-12-to-16"/>
+    <w:p>
+      <w:pPr>
+        <w:pStyle w:val="Heading3"/>
+      </w:pPr>
+      <w:r>
+        <w:t xml:space="preserve">D. Robots and the bet, 12 to 16</w:t>
+      </w:r>
+    </w:p>
+    <w:p>
+      <w:pPr>
+        <w:pStyle w:val="FirstParagraph"/>
+      </w:pPr>
+      <w:r>
+        <w:t xml:space="preserve">Nvidia calls this the decade of physical AI, and Jensen Huang says the next wave is robots.</w:t>
+      </w:r>
+    </w:p>
+    <w:p>
+      <w:pPr>
+        <w:pStyle w:val="BodyText"/>
+      </w:pPr>
+      <w:r>
+        <w:t xml:space="preserve">Why run robot competitions under a racing brand? What does a robot race teach you that a car race cannot?</w:t>
+      </w:r>
+    </w:p>
+    <w:p>
+      <w:pPr>
+        <w:pStyle w:val="BodyText"/>
+      </w:pPr>
+      <w:r>
+        <w:t xml:space="preserve">Are you a customer of Nvidia’s story or a competitor to it, since your robots have a human inside?</w:t>
+      </w:r>
+    </w:p>
+    <w:p>
+      <w:pPr>
+        <w:pStyle w:val="BodyText"/>
+      </w:pPr>
+      <w:r>
+        <w:t xml:space="preserve">The memory makers say supply stays tight for three more years. If hardware gets dearer every quarter, do you end up owning more cars or fewer, and do drivers start bringing their own cockpits?</w:t>
+      </w:r>
+    </w:p>
+    <w:bookmarkEnd w:id="94"/>
+    <w:bookmarkStart w:id="95" w:name="e.-money-and-close-16-to-20"/>
+    <w:p>
+      <w:pPr>
+        <w:pStyle w:val="Heading3"/>
+      </w:pPr>
+      <w:r>
+        <w:t xml:space="preserve">E. Money and close, 16 to 20</w:t>
+      </w:r>
+    </w:p>
+    <w:p>
+      <w:pPr>
+        <w:pStyle w:val="FirstParagraph"/>
+      </w:pPr>
+      <w:r>
+        <w:t xml:space="preserve">Where does the money come from today: tickets, sponsors, the telecom partners, technology licensing? Which one do you want it to be in three years?</w:t>
+      </w:r>
+    </w:p>
+    <w:p>
+      <w:pPr>
+        <w:pStyle w:val="BodyText"/>
+      </w:pPr>
+      <w:r>
+        <w:t xml:space="preserve">Describe the final in 2030. Where are the cars, where are the drivers, and who is commentating?</w:t>
+      </w:r>
+    </w:p>
+    <w:p>
+      <w:pPr>
+        <w:pStyle w:val="BodyText"/>
+      </w:pPr>
+      <w:r>
+        <w:t xml:space="preserve">If you take away the first-time novelty, why does anyone come back?</w:t>
+      </w:r>
+    </w:p>
+    <w:p>
+      <w:pPr>
+        <w:pStyle w:val="BodyText"/>
+      </w:pPr>
+      <w:r>
+        <w:t xml:space="preserve">Short answers, first thing that comes to mind. Initial D or Drive to Survive? Who in the world would you most like to race? Would you put your champion against an AI driver, the way Abu Dhabi does? Finish the sentence: people think we are an RC car company, but…</w:t>
+      </w:r>
+    </w:p>
+    <w:bookmarkEnd w:id="95"/>
+    <w:bookmarkStart w:id="96" w:name="held-back"/>
+    <w:p>
+      <w:pPr>
+        <w:pStyle w:val="Heading3"/>
+      </w:pPr>
+      <w:r>
+        <w:t xml:space="preserve">Held back</w:t>
+      </w:r>
+    </w:p>
+    <w:p>
+      <w:pPr>
+        <w:pStyle w:val="FirstParagraph"/>
+      </w:pPr>
+      <w:r>
+        <w:t xml:space="preserve">What did you change after the last event that nobody noticed?</w:t>
+      </w:r>
+    </w:p>
+    <w:bookmarkEnd w:id="96"/>
+    <w:bookmarkEnd w:id="97"/>
+    <w:bookmarkStart w:id="99" w:name="narration-part-2"/>
     <w:p>
       <w:pPr>
         <w:pStyle w:val="Heading2"/>
       </w:pPr>
       <w:r>
-        <w:t xml:space="preserve">4. Bridge to the founder, voice-over</w:t>
+        <w:t xml:space="preserve">Narration, part 2</w:t>
+      </w:r>
+    </w:p>
+    <w:bookmarkStart w:id="98" w:name="bridge-to-the-cto"/>
+    <w:p>
+      <w:pPr>
+        <w:pStyle w:val="Heading3"/>
+      </w:pPr>
+      <w:r>
+        <w:t xml:space="preserve">Bridge to the CTO</w:t>
       </w:r>
     </w:p>
     <w:p>
@@ -13154,17 +13439,27 @@
         <w:pStyle w:val="FirstParagraph"/>
       </w:pPr>
       <w:r>
-        <w:t xml:space="preserve">In March, during the Formula 1 weekend, they ran their first season final a few hundred metres from the real circuit. The cars were on this track. The drivers were ten kilometres away. [The winner’s name] won by [margin], which is less than the time it takes the video to reach his screen.</w:t>
-      </w:r>
-    </w:p>
-    <w:bookmarkEnd w:id="88"/>
-    <w:bookmarkStart w:id="89" w:name="founder-sit-down"/>
+        <w:t xml:space="preserve">Here is the whole trick in one picture. Control goes out, video comes back, and the race lives in the round trip. The company says that round trip is under eighty milliseconds. I wanted to know where every one of them goes.</w:t>
+      </w:r>
+    </w:p>
+    <w:bookmarkEnd w:id="98"/>
+    <w:bookmarkEnd w:id="99"/>
+    <w:bookmarkStart w:id="108" w:name="cto-20-minutes-1"/>
     <w:p>
       <w:pPr>
         <w:pStyle w:val="Heading2"/>
       </w:pPr>
       <w:r>
-        <w:t xml:space="preserve">5. Founder sit-down</w:t>
+        <w:t xml:space="preserve">CTO, 20 minutes</w:t>
+      </w:r>
+    </w:p>
+    <w:bookmarkStart w:id="100" w:name="before-the-camera-rolls-1"/>
+    <w:p>
+      <w:pPr>
+        <w:pStyle w:val="Heading3"/>
+      </w:pPr>
+      <w:r>
+        <w:t xml:space="preserve">Before the camera rolls</w:t>
       </w:r>
     </w:p>
     <w:p>
@@ -13172,7 +13467,25 @@
         <w:pStyle w:val="FirstParagraph"/>
       </w:pPr>
       <w:r>
-        <w:t xml:space="preserve">Tell me about the first time someone drove one of your cars from another city. Where were you standing, and what went wrong?</w:t>
+        <w:t xml:space="preserve">I built T-boxes for years. Talk to me like an engineer. If I get something wrong, say so on camera; that is the good part.</w:t>
+      </w:r>
+    </w:p>
+    <w:bookmarkEnd w:id="100"/>
+    <w:bookmarkStart w:id="101" w:name="a.-the-number-0-to-4"/>
+    <w:p>
+      <w:pPr>
+        <w:pStyle w:val="Heading3"/>
+      </w:pPr>
+      <w:r>
+        <w:t xml:space="preserve">A. The number, 0 to 4</w:t>
+      </w:r>
+    </w:p>
+    <w:p>
+      <w:pPr>
+        <w:pStyle w:val="FirstParagraph"/>
+      </w:pPr>
+      <w:r>
+        <w:t xml:space="preserve">Vay drives real cars in Las Vegas at city speed, and their engineers talk about tens of milliseconds. Your cars go a lot faster than that.</w:t>
       </w:r>
     </w:p>
     <w:p>
@@ -13180,7 +13493,7 @@
         <w:pStyle w:val="BodyText"/>
       </w:pPr>
       <w:r>
-        <w:t xml:space="preserve">If I am a Formula 1 fan in London, what is HURA GP in one sentence? And if I am an esports fan in Seoul?</w:t>
+        <w:t xml:space="preserve">End to end, from the car’s camera to the driver’s eye and back to the steering: how many milliseconds? Best case, race-day typical, and the worst you can still race on.</w:t>
       </w:r>
     </w:p>
     <w:p>
@@ -13188,7 +13501,7 @@
         <w:pStyle w:val="BodyText"/>
       </w:pPr>
       <w:r>
-        <w:t xml:space="preserve">This final: how many drivers, how many cars, where are the drivers sitting, and how far is the farthest one from the track?</w:t>
+        <w:t xml:space="preserve">How do you measure that? Not the spec, the measurement.</w:t>
       </w:r>
     </w:p>
     <w:p>
@@ -13196,7 +13509,7 @@
         <w:pStyle w:val="BodyText"/>
       </w:pPr>
       <w:r>
-        <w:t xml:space="preserve">What happens when a car crashes? Who pays, who fixes it, and does the driver see it?</w:t>
+        <w:t xml:space="preserve">Where do those milliseconds go: encode, radio, transit, decode, screen? Which one did you fight hardest?</w:t>
       </w:r>
     </w:p>
     <w:p>
@@ -13204,7 +13517,25 @@
         <w:pStyle w:val="BodyText"/>
       </w:pPr>
       <w:r>
-        <w:t xml:space="preserve">Two drivers, one in Shanghai and one in Chengdu. The Chengdu driver has forty milliseconds more delay. Is that fair? What do you do about it?</w:t>
+        <w:t xml:space="preserve">What did it cost you to win that fight? Months, money, a redesign?</w:t>
+      </w:r>
+    </w:p>
+    <w:bookmarkEnd w:id="101"/>
+    <w:bookmarkStart w:id="102" w:name="b.-what-breaks-4-to-8"/>
+    <w:p>
+      <w:pPr>
+        <w:pStyle w:val="Heading3"/>
+      </w:pPr>
+      <w:r>
+        <w:t xml:space="preserve">B. What breaks, 4 to 8</w:t>
+      </w:r>
+    </w:p>
+    <w:p>
+      <w:pPr>
+        <w:pStyle w:val="FirstParagraph"/>
+      </w:pPr>
+      <w:r>
+        <w:t xml:space="preserve">A T-box fails safe by doing nothing. Your box cannot do nothing at sixty kilometres an hour.</w:t>
       </w:r>
     </w:p>
     <w:p>
@@ -13212,7 +13543,7 @@
         <w:pStyle w:val="BodyText"/>
       </w:pPr>
       <w:r>
-        <w:t xml:space="preserve">Is this esports, motorsport, or something that does not have a name yet? Who do you want to sanction you, the esports federations or the motorsport bodies?</w:t>
+        <w:t xml:space="preserve">The link drops at sixty kilometres an hour on the straight. What happens in the next two hundred milliseconds, in order?</w:t>
       </w:r>
     </w:p>
     <w:p>
@@ -13220,7 +13551,7 @@
         <w:pStyle w:val="BodyText"/>
       </w:pPr>
       <w:r>
-        <w:t xml:space="preserve">Who wins: sim racers, RC racers, or people who have driven on a real track? Has anyone surprised you?</w:t>
+        <w:t xml:space="preserve">Has it happened in a race? Tell me about that one.</w:t>
       </w:r>
     </w:p>
     <w:p>
@@ -13228,7 +13559,7 @@
         <w:pStyle w:val="BodyText"/>
       </w:pPr>
       <w:r>
-        <w:t xml:space="preserve">Who watched the last event, how many, and what did people write in the comments that you did not expect?</w:t>
+        <w:t xml:space="preserve">Does the driver see where the car is, or where it will be? If you predict, is that an assist the referee should know about?</w:t>
       </w:r>
     </w:p>
     <w:p>
@@ -13236,7 +13567,25 @@
         <w:pStyle w:val="BodyText"/>
       </w:pPr>
       <w:r>
-        <w:t xml:space="preserve">If a driver in Stockholm wanted to race in your next final, what would you need: technically, legally, commercially?</w:t>
+        <w:t xml:space="preserve">Which parts did you build and which did you buy: the modem, the codec, the transport protocol, the control stack, the box itself?</w:t>
+      </w:r>
+    </w:p>
+    <w:bookmarkEnd w:id="102"/>
+    <w:bookmarkStart w:id="103" w:name="c.-distance-8-to-12"/>
+    <w:p>
+      <w:pPr>
+        <w:pStyle w:val="Heading3"/>
+      </w:pPr>
+      <w:r>
+        <w:t xml:space="preserve">C. Distance, 8 to 12</w:t>
+      </w:r>
+    </w:p>
+    <w:p>
+      <w:pPr>
+        <w:pStyle w:val="FirstParagraph"/>
+      </w:pPr>
+      <w:r>
+        <w:t xml:space="preserve">Einride drove a truck in Sweden from Barcelona in 2019. Ericsson and Vay did Berlin from Barcelona in 2023 and said the video never went over two hundred milliseconds.</w:t>
       </w:r>
     </w:p>
     <w:p>
@@ -13244,7 +13593,7 @@
         <w:pStyle w:val="BodyText"/>
       </w:pPr>
       <w:r>
-        <w:t xml:space="preserve">Why run robot competitions under a racing brand? What does a robot race teach you that a car race cannot?</w:t>
+        <w:t xml:space="preserve">Shanghai to Stockholm is about a hundred and sixty milliseconds there and back on today’s internet, double what you quote for the track. Have you driven across a border yet? What was the number, and what broke?</w:t>
       </w:r>
     </w:p>
     <w:p>
@@ -13252,7 +13601,7 @@
         <w:pStyle w:val="BodyText"/>
       </w:pPr>
       <w:r>
-        <w:t xml:space="preserve">Where does the money come from today: tickets, sponsors, the telecom partners, technology licensing? Which one do you want it to be in three years?</w:t>
+        <w:t xml:space="preserve">If we put a driver in Stockholm during this shoot, what would you need from me by Monday?</w:t>
       </w:r>
     </w:p>
     <w:p>
@@ -13260,7 +13609,7 @@
         <w:pStyle w:val="BodyText"/>
       </w:pPr>
       <w:r>
-        <w:t xml:space="preserve">A sceptic in Europe will say: it is RC cars with a 5G sticker. What is your answer?</w:t>
+        <w:t xml:space="preserve">Do you need the telecom operator’s cooperation, private 5G, slicing, edge computing, or does this run on a home connection? Which one does the final run on?</w:t>
       </w:r>
     </w:p>
     <w:p>
@@ -13268,7 +13617,25 @@
         <w:pStyle w:val="BodyText"/>
       </w:pPr>
       <w:r>
-        <w:t xml:space="preserve">What did you change after the last event that nobody noticed?</w:t>
+        <w:t xml:space="preserve">If Ericsson’s or Huawei’s 5G team called tomorrow, what would you ask them for?</w:t>
+      </w:r>
+    </w:p>
+    <w:bookmarkEnd w:id="103"/>
+    <w:bookmarkStart w:id="104" w:name="d.-car-to-robot-12-to-15"/>
+    <w:p>
+      <w:pPr>
+        <w:pStyle w:val="Heading3"/>
+      </w:pPr>
+      <w:r>
+        <w:t xml:space="preserve">D. Car to robot, 12 to 15</w:t>
+      </w:r>
+    </w:p>
+    <w:p>
+      <w:pPr>
+        <w:pStyle w:val="FirstParagraph"/>
+      </w:pPr>
+      <w:r>
+        <w:t xml:space="preserve">Beijing ran six hundred and sixty-six teams of humanoids in August, and every operator was standing in the venue with a controller.</w:t>
       </w:r>
     </w:p>
     <w:p>
@@ -13276,7 +13643,7 @@
         <w:pStyle w:val="BodyText"/>
       </w:pPr>
       <w:r>
-        <w:t xml:space="preserve">The memory makers say supply stays tight for three more years. If hardware gets dearer every quarter, do you end up owning more cars or fewer, and do drivers start bringing their own cockpits?</w:t>
+        <w:t xml:space="preserve">When the far end is a humanoid instead of a car, what changes in the stack? Hands, balance, more cameras, less speed?</w:t>
       </w:r>
     </w:p>
     <w:p>
@@ -13284,7 +13651,7 @@
         <w:pStyle w:val="BodyText"/>
       </w:pPr>
       <w:r>
-        <w:t xml:space="preserve">Describe the final in 2030. Where are the cars, where are the drivers, and who is commentating?</w:t>
+        <w:t xml:space="preserve">After the first cross-country robot run, what did the operator on the other end tell you that you did not expect?</w:t>
       </w:r>
     </w:p>
     <w:p>
@@ -13292,17 +13659,145 @@
         <w:pStyle w:val="BodyText"/>
       </w:pPr>
       <w:r>
-        <w:t xml:space="preserve">If you take away the first-time novelty, why does anyone come back?</w:t>
-      </w:r>
-    </w:p>
-    <w:bookmarkEnd w:id="89"/>
-    <w:bookmarkStart w:id="90" w:name="bridge-to-the-cto-voice-over"/>
+        <w:t xml:space="preserve">Which humanoid will be on your track first, and will it be driven from another country?</w:t>
+      </w:r>
+    </w:p>
+    <w:bookmarkEnd w:id="104"/>
+    <w:bookmarkStart w:id="105" w:name="e.-the-chip-story-15-to-18"/>
+    <w:p>
+      <w:pPr>
+        <w:pStyle w:val="Heading3"/>
+      </w:pPr>
+      <w:r>
+        <w:t xml:space="preserve">E. The chip story, 15 to 18</w:t>
+      </w:r>
+    </w:p>
+    <w:p>
+      <w:pPr>
+        <w:pStyle w:val="FirstParagraph"/>
+      </w:pPr>
+      <w:r>
+        <w:t xml:space="preserve">Samsung has reportedly raised memory prices by up to sixty percent since September, and SK Hynix says supply stays tight for three more years.</w:t>
+      </w:r>
+    </w:p>
+    <w:p>
+      <w:pPr>
+        <w:pStyle w:val="BodyText"/>
+      </w:pPr>
+      <w:r>
+        <w:t xml:space="preserve">Your cockpits, your edge servers and your Ro-boxes all carry memory. What has the AI boom done to the cost of building one car and one cockpit?</w:t>
+      </w:r>
+    </w:p>
+    <w:p>
+      <w:pPr>
+        <w:pStyle w:val="BodyText"/>
+      </w:pPr>
+      <w:r>
+        <w:t xml:space="preserve">Give me the number. Last year versus this year, one cockpit.</w:t>
+      </w:r>
+    </w:p>
+    <w:p>
+      <w:pPr>
+        <w:pStyle w:val="BodyText"/>
+      </w:pPr>
+      <w:r>
+        <w:t xml:space="preserve">When SK Hynix and Samsung are selling every chip to Nvidia’s customers, where does a Shanghai sports-technology company stand in the queue? Do you buy Chinese memory, CXMT or YMTC, and does it work?</w:t>
+      </w:r>
+    </w:p>
+    <w:p>
+      <w:pPr>
+        <w:pStyle w:val="BodyText"/>
+      </w:pPr>
+      <w:r>
+        <w:t xml:space="preserve">Every race produces synchronised video, control inputs and car state. Storage is exactly the thing that got expensive this year. Is your data a product, or a cost?</w:t>
+      </w:r>
+    </w:p>
+    <w:bookmarkEnd w:id="105"/>
+    <w:bookmarkStart w:id="106" w:name="f.-limits-and-close-18-to-20"/>
+    <w:p>
+      <w:pPr>
+        <w:pStyle w:val="Heading3"/>
+      </w:pPr>
+      <w:r>
+        <w:t xml:space="preserve">F. Limits and close, 18 to 20</w:t>
+      </w:r>
+    </w:p>
+    <w:p>
+      <w:pPr>
+        <w:pStyle w:val="FirstParagraph"/>
+      </w:pPr>
+      <w:r>
+        <w:t xml:space="preserve">What can this not do yet that people assume it can?</w:t>
+      </w:r>
+    </w:p>
+    <w:p>
+      <w:pPr>
+        <w:pStyle w:val="BodyText"/>
+      </w:pPr>
+      <w:r>
+        <w:t xml:space="preserve">What is the one thing that, if it broke on race day, would end the company?</w:t>
+      </w:r>
+    </w:p>
+    <w:p>
+      <w:pPr>
+        <w:pStyle w:val="BodyText"/>
+      </w:pPr>
+      <w:r>
+        <w:t xml:space="preserve">Can you put the latency on the screen, live, while I drive a lap?</w:t>
+      </w:r>
+    </w:p>
+    <w:p>
+      <w:pPr>
+        <w:pStyle w:val="BodyText"/>
+      </w:pPr>
+      <w:r>
+        <w:t xml:space="preserve">Short answers. Nvidia or Huawei: whose chips are in the box? If DRAM doubles again, what do you cut first? Your latency, in one word. One number everyone should remember from today.</w:t>
+      </w:r>
+    </w:p>
+    <w:bookmarkEnd w:id="106"/>
+    <w:bookmarkStart w:id="107" w:name="held-back-1"/>
+    <w:p>
+      <w:pPr>
+        <w:pStyle w:val="Heading3"/>
+      </w:pPr>
+      <w:r>
+        <w:t xml:space="preserve">Held back</w:t>
+      </w:r>
+    </w:p>
+    <w:p>
+      <w:pPr>
+        <w:pStyle w:val="FirstParagraph"/>
+      </w:pPr>
+      <w:r>
+        <w:t xml:space="preserve">Someone on the internet wants to take over a car mid-race. How do you stop them?</w:t>
+      </w:r>
+    </w:p>
+    <w:p>
+      <w:pPr>
+        <w:pStyle w:val="BodyText"/>
+      </w:pPr>
+      <w:r>
+        <w:t xml:space="preserve">DeepSeek proved China can do more with fewer chips. Is there a DeepSeek move in teleoperation: more with less bandwidth, cheaper hardware, smaller models?</w:t>
+      </w:r>
+    </w:p>
+    <w:bookmarkEnd w:id="107"/>
+    <w:bookmarkEnd w:id="108"/>
+    <w:bookmarkStart w:id="110" w:name="narration-part-3"/>
     <w:p>
       <w:pPr>
         <w:pStyle w:val="Heading2"/>
       </w:pPr>
       <w:r>
-        <w:t xml:space="preserve">6. Bridge to the CTO, voice-over</w:t>
+        <w:t xml:space="preserve">Narration, part 3</w:t>
+      </w:r>
+    </w:p>
+    <w:bookmarkStart w:id="109" w:name="bridge-to-the-broadcast-lead"/>
+    <w:p>
+      <w:pPr>
+        <w:pStyle w:val="Heading3"/>
+      </w:pPr>
+      <w:r>
+        <w:t xml:space="preserve">Bridge to the broadcast lead</w:t>
       </w:r>
     </w:p>
     <w:p>
@@ -13310,17 +13805,27 @@
         <w:pStyle w:val="FirstParagraph"/>
       </w:pPr>
       <w:r>
-        <w:t xml:space="preserve">Here is the whole trick in one picture. Control goes out, video comes back, and the race lives in the round trip. The company says that round trip is under eighty milliseconds. I wanted to know where every one of them goes.</w:t>
-      </w:r>
-    </w:p>
-    <w:bookmarkEnd w:id="90"/>
-    <w:bookmarkStart w:id="91" w:name="cto-sit-down"/>
+        <w:t xml:space="preserve">There are two kinds of video in this building. One has to arrive in milliseconds or the car crashes. The other can arrive seconds late and nobody minds. The first is engineering. The second is show business. Both have to work.</w:t>
+      </w:r>
+    </w:p>
+    <w:bookmarkEnd w:id="109"/>
+    <w:bookmarkEnd w:id="110"/>
+    <w:bookmarkStart w:id="116" w:name="broadcast-lead-15-minutes-1"/>
     <w:p>
       <w:pPr>
         <w:pStyle w:val="Heading2"/>
       </w:pPr>
       <w:r>
-        <w:t xml:space="preserve">7. CTO sit-down</w:t>
+        <w:t xml:space="preserve">Broadcast lead, 15 minutes</w:t>
+      </w:r>
+    </w:p>
+    <w:bookmarkStart w:id="111" w:name="a.-going-live-0-to-4"/>
+    <w:p>
+      <w:pPr>
+        <w:pStyle w:val="Heading3"/>
+      </w:pPr>
+      <w:r>
+        <w:t xml:space="preserve">A. Going live, 0 to 4</w:t>
       </w:r>
     </w:p>
     <w:p>
@@ -13328,7 +13833,7 @@
         <w:pStyle w:val="FirstParagraph"/>
       </w:pPr>
       <w:r>
-        <w:t xml:space="preserve">Explain the system to me as if I were the T-box engineer I used to be. What is inside the Ro-box, and what lives in the cloud?</w:t>
+        <w:t xml:space="preserve">Walk me through the last sixty seconds before you go live. What are you looking at?</w:t>
       </w:r>
     </w:p>
     <w:p>
@@ -13336,7 +13841,25 @@
         <w:pStyle w:val="BodyText"/>
       </w:pPr>
       <w:r>
-        <w:t xml:space="preserve">End to end, from the car’s camera to the driver’s eye and back to the steering: how many milliseconds? Best case, race-day typical, and the worst you can still race on.</w:t>
+        <w:t xml:space="preserve">There are two kinds of video in this building: what the driver sees and what the audience sees. How different are they, and why?</w:t>
+      </w:r>
+    </w:p>
+    <w:bookmarkEnd w:id="111"/>
+    <w:bookmarkStart w:id="112" w:name="b.-the-craft-4-to-9"/>
+    <w:p>
+      <w:pPr>
+        <w:pStyle w:val="Heading3"/>
+      </w:pPr>
+      <w:r>
+        <w:t xml:space="preserve">B. The craft, 4 to 9</w:t>
+      </w:r>
+    </w:p>
+    <w:p>
+      <w:pPr>
+        <w:pStyle w:val="FirstParagraph"/>
+      </w:pPr>
+      <w:r>
+        <w:t xml:space="preserve">Drone Racing League put the pilot’s eyes on ESPN. You have the driver’s eyes and the car’s eyes at the same time.</w:t>
       </w:r>
     </w:p>
     <w:p>
@@ -13344,7 +13867,7 @@
         <w:pStyle w:val="BodyText"/>
       </w:pPr>
       <w:r>
-        <w:t xml:space="preserve">Where do those milliseconds go: encode, radio, transit, decode, screen? Which one did you fight hardest?</w:t>
+        <w:t xml:space="preserve">How many cameras, which ones are on the car, and which single shot could you not broadcast a race without?</w:t>
       </w:r>
     </w:p>
     <w:p>
@@ -13352,7 +13875,7 @@
         <w:pStyle w:val="BodyText"/>
       </w:pPr>
       <w:r>
-        <w:t xml:space="preserve">Shanghai to Stockholm is about a hundred and sixty milliseconds there and back on today’s internet, double what you quote for the track. Have you driven across a border yet? What was the number, and what broke?</w:t>
+        <w:t xml:space="preserve">What does a viewer on Douyin see that a person in the venue never sees?</w:t>
       </w:r>
     </w:p>
     <w:p>
@@ -13360,7 +13883,7 @@
         <w:pStyle w:val="BodyText"/>
       </w:pPr>
       <w:r>
-        <w:t xml:space="preserve">The link drops at sixty kilometres an hour on the straight. What happens in the next two hundred milliseconds, in order?</w:t>
+        <w:t xml:space="preserve">Do you show the latency number to the audience? Why, or why not?</w:t>
       </w:r>
     </w:p>
     <w:p>
@@ -13368,7 +13891,7 @@
         <w:pStyle w:val="BodyText"/>
       </w:pPr>
       <w:r>
-        <w:t xml:space="preserve">Does the driver see where the car is, or where it will be? If you predict, is that an assist the referee should know about?</w:t>
+        <w:t xml:space="preserve">What if you did? What would the comments say?</w:t>
       </w:r>
     </w:p>
     <w:p>
@@ -13376,7 +13899,25 @@
         <w:pStyle w:val="BodyText"/>
       </w:pPr>
       <w:r>
-        <w:t xml:space="preserve">Which parts did you build and which did you buy: the modem, the codec, the transport protocol, the control stack, the box itself?</w:t>
+        <w:t xml:space="preserve">The best moment you have broadcast so far, and the one you wish you had not.</w:t>
+      </w:r>
+    </w:p>
+    <w:bookmarkEnd w:id="112"/>
+    <w:bookmarkStart w:id="113" w:name="c.-the-audience-9-to-13"/>
+    <w:p>
+      <w:pPr>
+        <w:pStyle w:val="Heading3"/>
+      </w:pPr>
+      <w:r>
+        <w:t xml:space="preserve">C. The audience, 9 to 13</w:t>
+      </w:r>
+    </w:p>
+    <w:p>
+      <w:pPr>
+        <w:pStyle w:val="FirstParagraph"/>
+      </w:pPr>
+      <w:r>
+        <w:t xml:space="preserve">Formula 1 took seventy years and a Netflix series to find a new audience.</w:t>
       </w:r>
     </w:p>
     <w:p>
@@ -13384,7 +13925,7 @@
         <w:pStyle w:val="BodyText"/>
       </w:pPr>
       <w:r>
-        <w:t xml:space="preserve">Do you need the telecom operator’s cooperation, private 5G, slicing, edge computing, or does this run on a home connection? Which one does the final run on?</w:t>
+        <w:t xml:space="preserve">What is your Drive to Survive?</w:t>
       </w:r>
     </w:p>
     <w:p>
@@ -13392,7 +13933,7 @@
         <w:pStyle w:val="BodyText"/>
       </w:pPr>
       <w:r>
-        <w:t xml:space="preserve">When the far end is a humanoid instead of a car, what changes in the stack? Hands, balance, more cameras, less speed?</w:t>
+        <w:t xml:space="preserve">How do you make someone who does not play games care? Who is the main character of a race: the driver, the car or the engineer?</w:t>
       </w:r>
     </w:p>
     <w:p>
@@ -13400,7 +13941,7 @@
         <w:pStyle w:val="BodyText"/>
       </w:pPr>
       <w:r>
-        <w:t xml:space="preserve">After the first cross-country robot run, what did the operator on the other end tell you that you did not expect?</w:t>
+        <w:t xml:space="preserve">Same race, a viewer in Shanghai and a viewer in Stockholm. Do you produce one show or two? Commentary, language, pacing?</w:t>
       </w:r>
     </w:p>
     <w:p>
@@ -13408,7 +13949,25 @@
         <w:pStyle w:val="BodyText"/>
       </w:pPr>
       <w:r>
-        <w:t xml:space="preserve">Every race produces video, control inputs and car state on the same timestamps. Is that a product? Who wants it?</w:t>
+        <w:t xml:space="preserve">Peak concurrent viewers, average watch time, and the share who watched to the end.</w:t>
+      </w:r>
+    </w:p>
+    <w:bookmarkEnd w:id="113"/>
+    <w:bookmarkStart w:id="114" w:name="d.-close-13-to-15"/>
+    <w:p>
+      <w:pPr>
+        <w:pStyle w:val="Heading3"/>
+      </w:pPr>
+      <w:r>
+        <w:t xml:space="preserve">D. Close, 13 to 15</w:t>
+      </w:r>
+    </w:p>
+    <w:p>
+      <w:pPr>
+        <w:pStyle w:val="FirstParagraph"/>
+      </w:pPr>
+      <w:r>
+        <w:t xml:space="preserve">What could a Western studio do with your feed that you cannot do yourselves?</w:t>
       </w:r>
     </w:p>
     <w:p>
@@ -13416,7 +13975,7 @@
         <w:pStyle w:val="BodyText"/>
       </w:pPr>
       <w:r>
-        <w:t xml:space="preserve">Someone on the internet wants to take over a car mid-race. How do you stop them?</w:t>
+        <w:t xml:space="preserve">What moment are you still waiting to capture?</w:t>
       </w:r>
     </w:p>
     <w:p>
@@ -13424,7 +13983,44 @@
         <w:pStyle w:val="BodyText"/>
       </w:pPr>
       <w:r>
-        <w:t xml:space="preserve">What can this not do yet that people assume it can?</w:t>
+        <w:t xml:space="preserve">Short answers. Real car or simulator: which is harder to broadcast? One number everyone should remember from today.</w:t>
+      </w:r>
+    </w:p>
+    <w:bookmarkEnd w:id="114"/>
+    <w:bookmarkStart w:id="115" w:name="held-back-2"/>
+    <w:p>
+      <w:pPr>
+        <w:pStyle w:val="Heading3"/>
+      </w:pPr>
+      <w:r>
+        <w:t xml:space="preserve">Held back</w:t>
+      </w:r>
+    </w:p>
+    <w:p>
+      <w:pPr>
+        <w:pStyle w:val="FirstParagraph"/>
+      </w:pPr>
+      <w:r>
+        <w:t xml:space="preserve">Which broadcast did you copy when you started, and where did you stop copying?</w:t>
+      </w:r>
+    </w:p>
+    <w:bookmarkEnd w:id="115"/>
+    <w:bookmarkEnd w:id="116"/>
+    <w:bookmarkStart w:id="117" w:name="driver-10-minutes-1"/>
+    <w:p>
+      <w:pPr>
+        <w:pStyle w:val="Heading2"/>
+      </w:pPr>
+      <w:r>
+        <w:t xml:space="preserve">Driver, 10 minutes</w:t>
+      </w:r>
+    </w:p>
+    <w:p>
+      <w:pPr>
+        <w:pStyle w:val="FirstParagraph"/>
+      </w:pPr>
+      <w:r>
+        <w:t xml:space="preserve">What does the delay feel like? Describe it in your body, not in numbers.</w:t>
       </w:r>
     </w:p>
     <w:p>
@@ -13432,7 +14028,7 @@
         <w:pStyle w:val="BodyText"/>
       </w:pPr>
       <w:r>
-        <w:t xml:space="preserve">Can you put the latency on the screen, live, while I drive a lap?</w:t>
+        <w:t xml:space="preserve">Where were you sitting when you lost the final? What was on the wall in front of you?</w:t>
       </w:r>
     </w:p>
     <w:p>
@@ -13440,7 +14036,7 @@
         <w:pStyle w:val="BodyText"/>
       </w:pPr>
       <w:r>
-        <w:t xml:space="preserve">If Ericsson’s or Huawei’s 5G team called tomorrow, what would you ask them for?</w:t>
+        <w:t xml:space="preserve">Your first crash in one of these: did you feel anything? What did you do in the next second?</w:t>
       </w:r>
     </w:p>
     <w:p>
@@ -13448,7 +14044,7 @@
         <w:pStyle w:val="BodyText"/>
       </w:pPr>
       <w:r>
-        <w:t xml:space="preserve">Samsung has reportedly raised memory prices by up to sixty percent since September, and DRAM is sold out for the year. Your cockpits, your edge servers and your Ro-boxes all carry memory. What has the AI boom done to the cost of building one car and one cockpit?</w:t>
+        <w:t xml:space="preserve">You have raced in a game, with a handheld transmitter, and like this. Rank them by how hard they are, and by how real they feel.</w:t>
       </w:r>
     </w:p>
     <w:p>
@@ -13456,7 +14052,7 @@
         <w:pStyle w:val="BodyText"/>
       </w:pPr>
       <w:r>
-        <w:t xml:space="preserve">When SK Hynix and Samsung are selling every chip to Nvidia’s customers, where does a Shanghai sports-technology company stand in the queue? Do you buy Chinese memory, CXMT or YMTC, and does it work?</w:t>
+        <w:t xml:space="preserve">What do you do differently on the last lap? Does the delay change how you brake?</w:t>
       </w:r>
     </w:p>
     <w:p>
@@ -13464,7 +14060,7 @@
         <w:pStyle w:val="BodyText"/>
       </w:pPr>
       <w:r>
-        <w:t xml:space="preserve">Every race produces synchronised video, control inputs and car state. Storage is exactly the thing that got expensive this year. Is your data a product, or a cost?</w:t>
+        <w:t xml:space="preserve">How do you train for this? Is there anything you do that a sim racer would laugh at?</w:t>
       </w:r>
     </w:p>
     <w:p>
@@ -13472,17 +14068,42 @@
         <w:pStyle w:val="BodyText"/>
       </w:pPr>
       <w:r>
-        <w:t xml:space="preserve">What is the one thing that, if it broke on race day, would end the company?</w:t>
-      </w:r>
-    </w:p>
-    <w:bookmarkEnd w:id="91"/>
-    <w:bookmarkStart w:id="92" w:name="bridge-to-the-broadcast-lead-voice-over"/>
+        <w:t xml:space="preserve">A sim racer in Europe thinks this would be easy for them. What would you tell them?</w:t>
+      </w:r>
+    </w:p>
+    <w:p>
+      <w:pPr>
+        <w:pStyle w:val="BodyText"/>
+      </w:pPr>
+      <w:r>
+        <w:t xml:space="preserve">What do you tell your parents you do?</w:t>
+      </w:r>
+    </w:p>
+    <w:p>
+      <w:pPr>
+        <w:pStyle w:val="BodyText"/>
+      </w:pPr>
+      <w:r>
+        <w:t xml:space="preserve">Short answers. Your latency, in one word. Motion seat: does it make you faster, or just happier? Who in the world would you most like to race?</w:t>
+      </w:r>
+    </w:p>
+    <w:bookmarkEnd w:id="117"/>
+    <w:bookmarkStart w:id="119" w:name="narration-part-4"/>
     <w:p>
       <w:pPr>
         <w:pStyle w:val="Heading2"/>
       </w:pPr>
       <w:r>
-        <w:t xml:space="preserve">8. Bridge to the broadcast lead, voice-over</w:t>
+        <w:t xml:space="preserve">Narration, part 4</w:t>
+      </w:r>
+    </w:p>
+    <w:bookmarkStart w:id="118" w:name="turn-to-robots"/>
+    <w:p>
+      <w:pPr>
+        <w:pStyle w:val="Heading3"/>
+      </w:pPr>
+      <w:r>
+        <w:t xml:space="preserve">Turn to robots</w:t>
       </w:r>
     </w:p>
     <w:p>
@@ -13490,17 +14111,18 @@
         <w:pStyle w:val="FirstParagraph"/>
       </w:pPr>
       <w:r>
-        <w:t xml:space="preserve">There are two kinds of video in this building. One has to arrive in milliseconds or the car crashes. The other can arrive seconds late and nobody minds. The first is engineering. The second is show business. Both have to work.</w:t>
-      </w:r>
-    </w:p>
-    <w:bookmarkEnd w:id="92"/>
-    <w:bookmarkStart w:id="93" w:name="broadcast-lead-sit-down"/>
+        <w:t xml:space="preserve">Then they showed me why the racing is only the beginning.</w:t>
+      </w:r>
+    </w:p>
+    <w:bookmarkEnd w:id="118"/>
+    <w:bookmarkEnd w:id="119"/>
+    <w:bookmarkStart w:id="120" w:name="robot-operator-8-minutes-1"/>
     <w:p>
       <w:pPr>
         <w:pStyle w:val="Heading2"/>
       </w:pPr>
       <w:r>
-        <w:t xml:space="preserve">9. Broadcast lead sit-down</w:t>
+        <w:t xml:space="preserve">Robot operator, 8 minutes</w:t>
       </w:r>
     </w:p>
     <w:p>
@@ -13508,7 +14130,7 @@
         <w:pStyle w:val="FirstParagraph"/>
       </w:pPr>
       <w:r>
-        <w:t xml:space="preserve">Walk me through the last sixty seconds before you go live. What are you looking at?</w:t>
+        <w:t xml:space="preserve">What are you controlling, from where, and how far away is it?</w:t>
       </w:r>
     </w:p>
     <w:p>
@@ -13516,7 +14138,7 @@
         <w:pStyle w:val="BodyText"/>
       </w:pPr>
       <w:r>
-        <w:t xml:space="preserve">There are two kinds of video in this building: what the driver sees and what the audience sees. How different are they, and why?</w:t>
+        <w:t xml:space="preserve">What is the hardest thing a robot does by remote: walking, picking something up, or turning around?</w:t>
       </w:r>
     </w:p>
     <w:p>
@@ -13524,7 +14146,7 @@
         <w:pStyle w:val="BodyText"/>
       </w:pPr>
       <w:r>
-        <w:t xml:space="preserve">How many cameras, which ones are on the car, and which single shot could you not broadcast a race without?</w:t>
+        <w:t xml:space="preserve">Has the robot ever done something you did not ask it to?</w:t>
       </w:r>
     </w:p>
     <w:p>
@@ -13532,7 +14154,7 @@
         <w:pStyle w:val="BodyText"/>
       </w:pPr>
       <w:r>
-        <w:t xml:space="preserve">What does a viewer on Douyin see that a person in the venue never sees?</w:t>
+        <w:t xml:space="preserve">When the robot falls, what do you feel?</w:t>
       </w:r>
     </w:p>
     <w:p>
@@ -13540,7 +14162,7 @@
         <w:pStyle w:val="BodyText"/>
       </w:pPr>
       <w:r>
-        <w:t xml:space="preserve">Do you show the latency number to the audience? Why, or why not?</w:t>
+        <w:t xml:space="preserve">You have driven the race car too. Which is harder, and why?</w:t>
       </w:r>
     </w:p>
     <w:p>
@@ -13548,7 +14170,7 @@
         <w:pStyle w:val="BodyText"/>
       </w:pPr>
       <w:r>
-        <w:t xml:space="preserve">The best moment you have broadcast so far, and the one you wish you had not.</w:t>
+        <w:t xml:space="preserve">Do you think of yourself as a gamer, a pilot, or a robot trainer?</w:t>
       </w:r>
     </w:p>
     <w:p>
@@ -13556,65 +14178,26 @@
         <w:pStyle w:val="BodyText"/>
       </w:pPr>
       <w:r>
-        <w:t xml:space="preserve">How do you make someone who does not play games care? Who is the main character of a race: the driver, the car or the engineer?</w:t>
-      </w:r>
-    </w:p>
-    <w:p>
-      <w:pPr>
-        <w:pStyle w:val="BodyText"/>
-      </w:pPr>
-      <w:r>
-        <w:t xml:space="preserve">Formula 1 took seventy years and a Netflix series to find a new audience. What is your Drive to Survive?</w:t>
-      </w:r>
-    </w:p>
-    <w:p>
-      <w:pPr>
-        <w:pStyle w:val="BodyText"/>
-      </w:pPr>
-      <w:r>
-        <w:t xml:space="preserve">Same race, a viewer in Shanghai and a viewer in Stockholm. Do you produce one show or two? Commentary, language, pacing?</w:t>
-      </w:r>
-    </w:p>
-    <w:p>
-      <w:pPr>
-        <w:pStyle w:val="BodyText"/>
-      </w:pPr>
-      <w:r>
-        <w:t xml:space="preserve">Which broadcast did you copy when you started, and where did you stop copying?</w:t>
-      </w:r>
-    </w:p>
-    <w:p>
-      <w:pPr>
-        <w:pStyle w:val="BodyText"/>
-      </w:pPr>
-      <w:r>
-        <w:t xml:space="preserve">Peak concurrent viewers, average watch time, and the share who watched to the end.</w:t>
-      </w:r>
-    </w:p>
-    <w:p>
-      <w:pPr>
-        <w:pStyle w:val="BodyText"/>
-      </w:pPr>
-      <w:r>
-        <w:t xml:space="preserve">What could a Western studio do with your feed that you cannot do yourselves?</w:t>
-      </w:r>
-    </w:p>
-    <w:p>
-      <w:pPr>
-        <w:pStyle w:val="BodyText"/>
-      </w:pPr>
-      <w:r>
-        <w:t xml:space="preserve">What moment are you still waiting to capture?</w:t>
-      </w:r>
-    </w:p>
-    <w:bookmarkEnd w:id="93"/>
-    <w:bookmarkStart w:id="94" w:name="the-driver"/>
+        <w:t xml:space="preserve">Short answers. Five years from now, what gets driven remotely that nobody expects? One word for the delay.</w:t>
+      </w:r>
+    </w:p>
+    <w:bookmarkEnd w:id="120"/>
+    <w:bookmarkStart w:id="124" w:name="narration-part-5"/>
     <w:p>
       <w:pPr>
         <w:pStyle w:val="Heading2"/>
       </w:pPr>
       <w:r>
-        <w:t xml:space="preserve">10. The driver</w:t>
+        <w:t xml:space="preserve">Narration, part 5</w:t>
+      </w:r>
+    </w:p>
+    <w:bookmarkStart w:id="121" w:name="cross-border-beat"/>
+    <w:p>
+      <w:pPr>
+        <w:pStyle w:val="Heading3"/>
+      </w:pPr>
+      <w:r>
+        <w:t xml:space="preserve">Cross-border beat</w:t>
       </w:r>
     </w:p>
     <w:p>
@@ -13622,73 +14205,54 @@
         <w:pStyle w:val="FirstParagraph"/>
       </w:pPr>
       <w:r>
-        <w:t xml:space="preserve">What does the delay feel like? Describe it in your body, not in numbers.</w:t>
-      </w:r>
-    </w:p>
-    <w:p>
-      <w:pPr>
-        <w:pStyle w:val="BodyText"/>
-      </w:pPr>
-      <w:r>
-        <w:t xml:space="preserve">Where were you sitting when you lost the final? What was on the wall in front of you?</w:t>
-      </w:r>
-    </w:p>
-    <w:p>
-      <w:pPr>
-        <w:pStyle w:val="BodyText"/>
-      </w:pPr>
-      <w:r>
-        <w:t xml:space="preserve">You have raced in a game, with a handheld transmitter, and like this. Rank them by how hard they are, and by how real they feel.</w:t>
-      </w:r>
-    </w:p>
-    <w:p>
-      <w:pPr>
-        <w:pStyle w:val="BodyText"/>
-      </w:pPr>
-      <w:r>
-        <w:t xml:space="preserve">Your first crash in one of these: did you feel anything? What did you do in the next second?</w:t>
-      </w:r>
-    </w:p>
-    <w:p>
-      <w:pPr>
-        <w:pStyle w:val="BodyText"/>
-      </w:pPr>
-      <w:r>
-        <w:t xml:space="preserve">What do you do differently on the last lap? Does the delay change how you brake?</w:t>
-      </w:r>
-    </w:p>
-    <w:p>
-      <w:pPr>
-        <w:pStyle w:val="BodyText"/>
-      </w:pPr>
-      <w:r>
-        <w:t xml:space="preserve">How do you train for this? Is there anything you do that a sim racer would laugh at?</w:t>
-      </w:r>
-    </w:p>
-    <w:p>
-      <w:pPr>
-        <w:pStyle w:val="BodyText"/>
-      </w:pPr>
-      <w:r>
-        <w:t xml:space="preserve">A sim racer in Europe thinks this would be easy for them. What would you tell them?</w:t>
-      </w:r>
-    </w:p>
-    <w:p>
-      <w:pPr>
-        <w:pStyle w:val="BodyText"/>
-      </w:pPr>
-      <w:r>
-        <w:t xml:space="preserve">What do you tell your parents you do?</w:t>
-      </w:r>
-    </w:p>
-    <w:bookmarkEnd w:id="94"/>
-    <w:bookmarkStart w:id="95" w:name="the-robot-operator"/>
+        <w:t xml:space="preserve">Shanghai to Stockholm and back is about a hundred and sixty milliseconds on today’s internet. Twice what they quote for the track. Nobody had tried to race across it. So we did.</w:t>
+      </w:r>
+    </w:p>
+    <w:bookmarkEnd w:id="121"/>
+    <w:bookmarkStart w:id="122" w:name="closing"/>
+    <w:p>
+      <w:pPr>
+        <w:pStyle w:val="Heading3"/>
+      </w:pPr>
+      <w:r>
+        <w:t xml:space="preserve">Closing</w:t>
+      </w:r>
+    </w:p>
+    <w:p>
+      <w:pPr>
+        <w:pStyle w:val="FirstParagraph"/>
+      </w:pPr>
+      <w:r>
+        <w:t xml:space="preserve">I came to Shanghai to see a race. What I found was a company using a sport to rehearse the next decade: humans, at a distance, driving machines that are not ready to drive themselves. The cars are the test. The robots are the business. And the clock, as always, is the only referee that cannot be argued with.</w:t>
+      </w:r>
+    </w:p>
+    <w:bookmarkEnd w:id="122"/>
+    <w:bookmarkStart w:id="123" w:name="last-line-to-camera-dry"/>
+    <w:p>
+      <w:pPr>
+        <w:pStyle w:val="Heading3"/>
+      </w:pPr>
+      <w:r>
+        <w:t xml:space="preserve">Last line, to camera, dry</w:t>
+      </w:r>
+    </w:p>
+    <w:p>
+      <w:pPr>
+        <w:pStyle w:val="FirstParagraph"/>
+      </w:pPr>
+      <w:r>
+        <w:t xml:space="preserve">For the record: I crashed. The delay was [number] milliseconds. The excuse was mine.</w:t>
+      </w:r>
+    </w:p>
+    <w:bookmarkEnd w:id="123"/>
+    <w:bookmarkEnd w:id="124"/>
+    <w:bookmarkStart w:id="125" w:name="words-to-watch"/>
     <w:p>
       <w:pPr>
         <w:pStyle w:val="Heading2"/>
       </w:pPr>
       <w:r>
-        <w:t xml:space="preserve">11. The robot operator</w:t>
+        <w:t xml:space="preserve">Words to watch</w:t>
       </w:r>
     </w:p>
     <w:p>
@@ -13696,57 +14260,319 @@
         <w:pStyle w:val="FirstParagraph"/>
       </w:pPr>
       <w:r>
-        <w:t xml:space="preserve">What are you controlling, from where, and how far away is it?</w:t>
-      </w:r>
-    </w:p>
-    <w:p>
-      <w:pPr>
-        <w:pStyle w:val="BodyText"/>
-      </w:pPr>
-      <w:r>
-        <w:t xml:space="preserve">What is the hardest thing a robot does by remote: walking, picking something up, or turning around?</w:t>
-      </w:r>
-    </w:p>
-    <w:p>
-      <w:pPr>
-        <w:pStyle w:val="BodyText"/>
-      </w:pPr>
-      <w:r>
-        <w:t xml:space="preserve">Has the robot ever done something you did not ask it to?</w:t>
-      </w:r>
-    </w:p>
-    <w:p>
-      <w:pPr>
-        <w:pStyle w:val="BodyText"/>
-      </w:pPr>
-      <w:r>
-        <w:t xml:space="preserve">When the robot falls, what do you feel?</w:t>
-      </w:r>
-    </w:p>
-    <w:p>
-      <w:pPr>
-        <w:pStyle w:val="BodyText"/>
-      </w:pPr>
-      <w:r>
-        <w:t xml:space="preserve">Do you think of yourself as a gamer, a pilot, or a robot trainer?</w:t>
-      </w:r>
-    </w:p>
-    <w:p>
-      <w:pPr>
-        <w:pStyle w:val="BodyText"/>
-      </w:pPr>
-      <w:r>
-        <w:t xml:space="preserve">You have driven the race car too. Which is harder, and why?</w:t>
-      </w:r>
-    </w:p>
-    <w:bookmarkEnd w:id="95"/>
-    <w:bookmarkStart w:id="96" w:name="turn-to-robots-voice-over"/>
-    <w:p>
-      <w:pPr>
-        <w:pStyle w:val="Heading2"/>
-      </w:pPr>
-      <w:r>
-        <w:t xml:space="preserve">12. Turn to robots, voice-over</w:t>
+        <w:t xml:space="preserve">Stress is on the capital letters. Say each one ten times before you read the script.</w:t>
+      </w:r>
+    </w:p>
+    <w:p>
+      <w:pPr>
+        <w:numPr>
+          <w:ilvl w:val="0"/>
+          <w:numId w:val="1048"/>
+        </w:numPr>
+        <w:pStyle w:val="Compact"/>
+      </w:pPr>
+      <w:r>
+        <w:t xml:space="preserve">milliseconds: MIL-li-sec-onds</w:t>
+      </w:r>
+    </w:p>
+    <w:p>
+      <w:pPr>
+        <w:numPr>
+          <w:ilvl w:val="0"/>
+          <w:numId w:val="1048"/>
+        </w:numPr>
+        <w:pStyle w:val="Compact"/>
+      </w:pPr>
+      <w:r>
+        <w:t xml:space="preserve">kilometres: ki-LOM-e-tres (or KIL-o-me-tres; pick one and keep it)</w:t>
+      </w:r>
+    </w:p>
+    <w:p>
+      <w:pPr>
+        <w:numPr>
+          <w:ilvl w:val="0"/>
+          <w:numId w:val="1048"/>
+        </w:numPr>
+        <w:pStyle w:val="Compact"/>
+      </w:pPr>
+      <w:r>
+        <w:t xml:space="preserve">referee: ref-er-EE</w:t>
+      </w:r>
+    </w:p>
+    <w:p>
+      <w:pPr>
+        <w:numPr>
+          <w:ilvl w:val="0"/>
+          <w:numId w:val="1048"/>
+        </w:numPr>
+        <w:pStyle w:val="Compact"/>
+      </w:pPr>
+      <w:r>
+        <w:t xml:space="preserve">physics: FIZ-iks</w:t>
+      </w:r>
+    </w:p>
+    <w:p>
+      <w:pPr>
+        <w:numPr>
+          <w:ilvl w:val="0"/>
+          <w:numId w:val="1048"/>
+        </w:numPr>
+        <w:pStyle w:val="Compact"/>
+      </w:pPr>
+      <w:r>
+        <w:t xml:space="preserve">latency: LAY-ten-see</w:t>
+      </w:r>
+    </w:p>
+    <w:p>
+      <w:pPr>
+        <w:numPr>
+          <w:ilvl w:val="0"/>
+          <w:numId w:val="1048"/>
+        </w:numPr>
+        <w:pStyle w:val="Compact"/>
+      </w:pPr>
+      <w:r>
+        <w:t xml:space="preserve">synchronised: SIN-kro-nized</w:t>
+      </w:r>
+    </w:p>
+    <w:p>
+      <w:pPr>
+        <w:numPr>
+          <w:ilvl w:val="0"/>
+          <w:numId w:val="1048"/>
+        </w:numPr>
+        <w:pStyle w:val="Compact"/>
+      </w:pPr>
+      <w:r>
+        <w:t xml:space="preserve">teleoperation: tel-ee-op-er-AY-shun</w:t>
+      </w:r>
+    </w:p>
+    <w:p>
+      <w:pPr>
+        <w:numPr>
+          <w:ilvl w:val="0"/>
+          <w:numId w:val="1048"/>
+        </w:numPr>
+        <w:pStyle w:val="Compact"/>
+      </w:pPr>
+      <w:r>
+        <w:t xml:space="preserve">autonomous: aw-TON-o-mus</w:t>
+      </w:r>
+    </w:p>
+    <w:p>
+      <w:pPr>
+        <w:numPr>
+          <w:ilvl w:val="0"/>
+          <w:numId w:val="1048"/>
+        </w:numPr>
+        <w:pStyle w:val="Compact"/>
+      </w:pPr>
+      <w:r>
+        <w:t xml:space="preserve">humanoid: HYOO-ma-noid</w:t>
+      </w:r>
+    </w:p>
+    <w:p>
+      <w:pPr>
+        <w:numPr>
+          <w:ilvl w:val="0"/>
+          <w:numId w:val="1048"/>
+        </w:numPr>
+        <w:pStyle w:val="Compact"/>
+      </w:pPr>
+      <w:r>
+        <w:t xml:space="preserve">esports: EE-sports</w:t>
+      </w:r>
+    </w:p>
+    <w:p>
+      <w:pPr>
+        <w:numPr>
+          <w:ilvl w:val="0"/>
+          <w:numId w:val="1048"/>
+        </w:numPr>
+        <w:pStyle w:val="Compact"/>
+      </w:pPr>
+      <w:r>
+        <w:t xml:space="preserve">motorsport: MO-tor-sport</w:t>
+      </w:r>
+    </w:p>
+    <w:p>
+      <w:pPr>
+        <w:numPr>
+          <w:ilvl w:val="0"/>
+          <w:numId w:val="1048"/>
+        </w:numPr>
+        <w:pStyle w:val="Compact"/>
+      </w:pPr>
+      <w:r>
+        <w:t xml:space="preserve">commentating: COM-men-tay-ting</w:t>
+      </w:r>
+    </w:p>
+    <w:p>
+      <w:pPr>
+        <w:numPr>
+          <w:ilvl w:val="0"/>
+          <w:numId w:val="1048"/>
+        </w:numPr>
+        <w:pStyle w:val="Compact"/>
+      </w:pPr>
+      <w:r>
+        <w:t xml:space="preserve">sceptic: SKEP-tik</w:t>
+      </w:r>
+    </w:p>
+    <w:p>
+      <w:pPr>
+        <w:numPr>
+          <w:ilvl w:val="0"/>
+          <w:numId w:val="1048"/>
+        </w:numPr>
+        <w:pStyle w:val="Compact"/>
+      </w:pPr>
+      <w:r>
+        <w:t xml:space="preserve">novelty: NOV-el-tee</w:t>
+      </w:r>
+    </w:p>
+    <w:p>
+      <w:pPr>
+        <w:numPr>
+          <w:ilvl w:val="0"/>
+          <w:numId w:val="1048"/>
+        </w:numPr>
+        <w:pStyle w:val="Compact"/>
+      </w:pPr>
+      <w:r>
+        <w:t xml:space="preserve">Stockholm: STOCK-holm</w:t>
+      </w:r>
+    </w:p>
+    <w:p>
+      <w:pPr>
+        <w:numPr>
+          <w:ilvl w:val="0"/>
+          <w:numId w:val="1048"/>
+        </w:numPr>
+        <w:pStyle w:val="Compact"/>
+      </w:pPr>
+      <w:r>
+        <w:t xml:space="preserve">Einride: EYN-ride</w:t>
+      </w:r>
+    </w:p>
+    <w:p>
+      <w:pPr>
+        <w:numPr>
+          <w:ilvl w:val="0"/>
+          <w:numId w:val="1048"/>
+        </w:numPr>
+        <w:pStyle w:val="Compact"/>
+      </w:pPr>
+      <w:r>
+        <w:t xml:space="preserve">Ericsson: ER-ik-son</w:t>
+      </w:r>
+    </w:p>
+    <w:p>
+      <w:pPr>
+        <w:numPr>
+          <w:ilvl w:val="0"/>
+          <w:numId w:val="1048"/>
+        </w:numPr>
+        <w:pStyle w:val="Compact"/>
+      </w:pPr>
+      <w:r>
+        <w:t xml:space="preserve">Nvidia: en-VID-ee-a</w:t>
+      </w:r>
+    </w:p>
+    <w:p>
+      <w:pPr>
+        <w:numPr>
+          <w:ilvl w:val="0"/>
+          <w:numId w:val="1048"/>
+        </w:numPr>
+        <w:pStyle w:val="Compact"/>
+      </w:pPr>
+      <w:r>
+        <w:t xml:space="preserve">Huawei: HWAH-way</w:t>
+      </w:r>
+    </w:p>
+    <w:p>
+      <w:pPr>
+        <w:numPr>
+          <w:ilvl w:val="0"/>
+          <w:numId w:val="1048"/>
+        </w:numPr>
+        <w:pStyle w:val="Compact"/>
+      </w:pPr>
+      <w:r>
+        <w:t xml:space="preserve">SK Hynix: ess-kay HY-niks</w:t>
+      </w:r>
+    </w:p>
+    <w:p>
+      <w:pPr>
+        <w:numPr>
+          <w:ilvl w:val="0"/>
+          <w:numId w:val="1048"/>
+        </w:numPr>
+        <w:pStyle w:val="Compact"/>
+      </w:pPr>
+      <w:r>
+        <w:t xml:space="preserve">Abu Dhabi: AB-oo DAB-ee</w:t>
+      </w:r>
+    </w:p>
+    <w:p>
+      <w:pPr>
+        <w:numPr>
+          <w:ilvl w:val="0"/>
+          <w:numId w:val="1048"/>
+        </w:numPr>
+        <w:pStyle w:val="Compact"/>
+      </w:pPr>
+      <w:r>
+        <w:t xml:space="preserve">Douyin: DOH-yin</w:t>
+      </w:r>
+    </w:p>
+    <w:p>
+      <w:pPr>
+        <w:numPr>
+          <w:ilvl w:val="0"/>
+          <w:numId w:val="1048"/>
+        </w:numPr>
+        <w:pStyle w:val="Compact"/>
+      </w:pPr>
+      <w:r>
+        <w:t xml:space="preserve">Anting: AN-ting</w:t>
+      </w:r>
+    </w:p>
+    <w:p>
+      <w:pPr>
+        <w:numPr>
+          <w:ilvl w:val="0"/>
+          <w:numId w:val="1048"/>
+        </w:numPr>
+        <w:pStyle w:val="Compact"/>
+      </w:pPr>
+      <w:r>
+        <w:t xml:space="preserve">the T-box: TEE-box; the Ro-box: ROH-box</w:t>
+      </w:r>
+    </w:p>
+    <w:p>
+      <w:pPr>
+        <w:numPr>
+          <w:ilvl w:val="0"/>
+          <w:numId w:val="1048"/>
+        </w:numPr>
+        <w:pStyle w:val="Compact"/>
+      </w:pPr>
+      <w:r>
+        <w:t xml:space="preserve">DRAM: DEE-ram</w:t>
+      </w:r>
+    </w:p>
+    <w:p>
+      <w:pPr>
+        <w:numPr>
+          <w:ilvl w:val="0"/>
+          <w:numId w:val="1048"/>
+        </w:numPr>
+        <w:pStyle w:val="Compact"/>
+      </w:pPr>
+      <w:r>
+        <w:t xml:space="preserve">5G-A: five-gee-AY</w:t>
       </w:r>
     </w:p>
     <w:p>
@@ -13754,550 +14580,6 @@
         <w:pStyle w:val="FirstParagraph"/>
       </w:pPr>
       <w:r>
-        <w:t xml:space="preserve">Then they showed me why the racing is only the beginning.</w:t>
-      </w:r>
-    </w:p>
-    <w:bookmarkEnd w:id="96"/>
-    <w:bookmarkStart w:id="97" w:name="Xe31147f012a25399881f4ef642f9b2990263b7c"/>
-    <w:p>
-      <w:pPr>
-        <w:pStyle w:val="Heading2"/>
-      </w:pPr>
-      <w:r>
-        <w:t xml:space="preserve">13. Trending questions, to the founder or the CTO</w:t>
-      </w:r>
-    </w:p>
-    <w:p>
-      <w:pPr>
-        <w:pStyle w:val="FirstParagraph"/>
-      </w:pPr>
-      <w:r>
-        <w:t xml:space="preserve">Nvidia calls this the decade of physical AI, and Jensen Huang says the next wave is robots. Are you a customer of that story or a competitor to it, since your robots have a human inside?</w:t>
-      </w:r>
-    </w:p>
-    <w:p>
-      <w:pPr>
-        <w:pStyle w:val="BodyText"/>
-      </w:pPr>
-      <w:r>
-        <w:t xml:space="preserve">DeepSeek proved China can do more with fewer chips. Is there a DeepSeek move in teleoperation: more with less bandwidth, cheaper hardware, smaller models?</w:t>
-      </w:r>
-    </w:p>
-    <w:p>
-      <w:pPr>
-        <w:pStyle w:val="BodyText"/>
-      </w:pPr>
-      <w:r>
-        <w:t xml:space="preserve">Unitree is listed, and Beijing ran six hundred and sixty-six teams of humanoids in August. Which humanoid will be on your track first, and will it be driven from another country?</w:t>
-      </w:r>
-    </w:p>
-    <w:p>
-      <w:pPr>
-        <w:pStyle w:val="BodyText"/>
-      </w:pPr>
-      <w:r>
-        <w:t xml:space="preserve">Chips are the front line of the US-China contest. Is there anything in your box you could not buy tomorrow if the rules changed, and what would you do?</w:t>
-      </w:r>
-    </w:p>
-    <w:p>
-      <w:pPr>
-        <w:pStyle w:val="BodyText"/>
-      </w:pPr>
-      <w:r>
-        <w:t xml:space="preserve">China Mobile is selling 5G-A now. Do you need it, or is this the first use case that makes an ordinary person feel why 5G existed?</w:t>
-      </w:r>
-    </w:p>
-    <w:bookmarkEnd w:id="97"/>
-    <w:bookmarkStart w:id="98" w:name="rapid-fire-for-everyone"/>
-    <w:p>
-      <w:pPr>
-        <w:pStyle w:val="Heading2"/>
-      </w:pPr>
-      <w:r>
-        <w:t xml:space="preserve">14. Rapid-fire, for everyone</w:t>
-      </w:r>
-    </w:p>
-    <w:p>
-      <w:pPr>
-        <w:pStyle w:val="FirstParagraph"/>
-      </w:pPr>
-      <w:r>
-        <w:t xml:space="preserve">Short answers, first thing that comes to mind.</w:t>
-      </w:r>
-    </w:p>
-    <w:p>
-      <w:pPr>
-        <w:pStyle w:val="BodyText"/>
-      </w:pPr>
-      <w:r>
-        <w:t xml:space="preserve">Real car or simulator: which is harder?</w:t>
-      </w:r>
-    </w:p>
-    <w:p>
-      <w:pPr>
-        <w:pStyle w:val="BodyText"/>
-      </w:pPr>
-      <w:r>
-        <w:t xml:space="preserve">Your latency, in one word.</w:t>
-      </w:r>
-    </w:p>
-    <w:p>
-      <w:pPr>
-        <w:pStyle w:val="BodyText"/>
-      </w:pPr>
-      <w:r>
-        <w:t xml:space="preserve">Initial D or Drive to Survive?</w:t>
-      </w:r>
-    </w:p>
-    <w:p>
-      <w:pPr>
-        <w:pStyle w:val="BodyText"/>
-      </w:pPr>
-      <w:r>
-        <w:t xml:space="preserve">Who in the world would you most like to race?</w:t>
-      </w:r>
-    </w:p>
-    <w:p>
-      <w:pPr>
-        <w:pStyle w:val="BodyText"/>
-      </w:pPr>
-      <w:r>
-        <w:t xml:space="preserve">Would you put your champion against an AI driver, the way Abu Dhabi does?</w:t>
-      </w:r>
-    </w:p>
-    <w:p>
-      <w:pPr>
-        <w:pStyle w:val="BodyText"/>
-      </w:pPr>
-      <w:r>
-        <w:t xml:space="preserve">Five years from now, what gets driven remotely that nobody expects?</w:t>
-      </w:r>
-    </w:p>
-    <w:p>
-      <w:pPr>
-        <w:pStyle w:val="BodyText"/>
-      </w:pPr>
-      <w:r>
-        <w:t xml:space="preserve">Finish the sentence: people think we are an RC car company, but…</w:t>
-      </w:r>
-    </w:p>
-    <w:p>
-      <w:pPr>
-        <w:pStyle w:val="BodyText"/>
-      </w:pPr>
-      <w:r>
-        <w:t xml:space="preserve">One number everyone should remember from today.</w:t>
-      </w:r>
-    </w:p>
-    <w:p>
-      <w:pPr>
-        <w:pStyle w:val="BodyText"/>
-      </w:pPr>
-      <w:r>
-        <w:t xml:space="preserve">Motion seat: does it make you faster, or just happier?</w:t>
-      </w:r>
-    </w:p>
-    <w:p>
-      <w:pPr>
-        <w:pStyle w:val="BodyText"/>
-      </w:pPr>
-      <w:r>
-        <w:t xml:space="preserve">Nvidia or Huawei: whose chips are in the box?</w:t>
-      </w:r>
-    </w:p>
-    <w:p>
-      <w:pPr>
-        <w:pStyle w:val="BodyText"/>
-      </w:pPr>
-      <w:r>
-        <w:t xml:space="preserve">If DRAM doubles again, what do you cut first?</w:t>
-      </w:r>
-    </w:p>
-    <w:p>
-      <w:pPr>
-        <w:pStyle w:val="BodyText"/>
-      </w:pPr>
-      <w:r>
-        <w:t xml:space="preserve">The memory shortage, in one word.</w:t>
-      </w:r>
-    </w:p>
-    <w:bookmarkEnd w:id="98"/>
-    <w:bookmarkStart w:id="99" w:name="cross-border-beat-voice-over"/>
-    <w:p>
-      <w:pPr>
-        <w:pStyle w:val="Heading2"/>
-      </w:pPr>
-      <w:r>
-        <w:t xml:space="preserve">15. Cross-border beat, voice-over</w:t>
-      </w:r>
-    </w:p>
-    <w:p>
-      <w:pPr>
-        <w:pStyle w:val="FirstParagraph"/>
-      </w:pPr>
-      <w:r>
-        <w:t xml:space="preserve">Shanghai to Stockholm and back is about a hundred and sixty milliseconds on today’s internet. Twice what they quote for the track. Nobody had tried to race across it. So we did.</w:t>
-      </w:r>
-    </w:p>
-    <w:bookmarkEnd w:id="99"/>
-    <w:bookmarkStart w:id="100" w:name="closing-voice-over"/>
-    <w:p>
-      <w:pPr>
-        <w:pStyle w:val="Heading2"/>
-      </w:pPr>
-      <w:r>
-        <w:t xml:space="preserve">16. Closing voice-over</w:t>
-      </w:r>
-    </w:p>
-    <w:p>
-      <w:pPr>
-        <w:pStyle w:val="FirstParagraph"/>
-      </w:pPr>
-      <w:r>
-        <w:t xml:space="preserve">I came to Shanghai to see a race. What I found was a company using a sport to rehearse the next decade: humans, at a distance, driving machines that are not ready to drive themselves. The cars are the test. The robots are the business. And the clock, as always, is the only referee that cannot be argued with.</w:t>
-      </w:r>
-    </w:p>
-    <w:bookmarkEnd w:id="100"/>
-    <w:bookmarkStart w:id="101" w:name="last-line-to-camera-dry"/>
-    <w:p>
-      <w:pPr>
-        <w:pStyle w:val="Heading2"/>
-      </w:pPr>
-      <w:r>
-        <w:t xml:space="preserve">17. Last line, to camera, dry</w:t>
-      </w:r>
-    </w:p>
-    <w:p>
-      <w:pPr>
-        <w:pStyle w:val="FirstParagraph"/>
-      </w:pPr>
-      <w:r>
-        <w:t xml:space="preserve">For the record: I crashed. The delay was [number] milliseconds. The excuse was mine.</w:t>
-      </w:r>
-    </w:p>
-    <w:bookmarkEnd w:id="101"/>
-    <w:bookmarkStart w:id="102" w:name="words-to-watch"/>
-    <w:p>
-      <w:pPr>
-        <w:pStyle w:val="Heading2"/>
-      </w:pPr>
-      <w:r>
-        <w:t xml:space="preserve">Words to watch</w:t>
-      </w:r>
-    </w:p>
-    <w:p>
-      <w:pPr>
-        <w:pStyle w:val="FirstParagraph"/>
-      </w:pPr>
-      <w:r>
-        <w:t xml:space="preserve">Stress is on the capital letters. Say each one ten times before you read the script.</w:t>
-      </w:r>
-    </w:p>
-    <w:p>
-      <w:pPr>
-        <w:numPr>
-          <w:ilvl w:val="0"/>
-          <w:numId w:val="1048"/>
-        </w:numPr>
-        <w:pStyle w:val="Compact"/>
-      </w:pPr>
-      <w:r>
-        <w:t xml:space="preserve">milliseconds: MIL-li-sec-onds</w:t>
-      </w:r>
-    </w:p>
-    <w:p>
-      <w:pPr>
-        <w:numPr>
-          <w:ilvl w:val="0"/>
-          <w:numId w:val="1048"/>
-        </w:numPr>
-        <w:pStyle w:val="Compact"/>
-      </w:pPr>
-      <w:r>
-        <w:t xml:space="preserve">kilometres: ki-LOM-e-tres (also KIL-o-me-tres; both are fine, pick one and keep it)</w:t>
-      </w:r>
-    </w:p>
-    <w:p>
-      <w:pPr>
-        <w:numPr>
-          <w:ilvl w:val="0"/>
-          <w:numId w:val="1048"/>
-        </w:numPr>
-        <w:pStyle w:val="Compact"/>
-      </w:pPr>
-      <w:r>
-        <w:t xml:space="preserve">referee: ref-er-EE</w:t>
-      </w:r>
-    </w:p>
-    <w:p>
-      <w:pPr>
-        <w:numPr>
-          <w:ilvl w:val="0"/>
-          <w:numId w:val="1048"/>
-        </w:numPr>
-        <w:pStyle w:val="Compact"/>
-      </w:pPr>
-      <w:r>
-        <w:t xml:space="preserve">physics: FIZ-iks</w:t>
-      </w:r>
-    </w:p>
-    <w:p>
-      <w:pPr>
-        <w:numPr>
-          <w:ilvl w:val="0"/>
-          <w:numId w:val="1048"/>
-        </w:numPr>
-        <w:pStyle w:val="Compact"/>
-      </w:pPr>
-      <w:r>
-        <w:t xml:space="preserve">latency: LAY-ten-see</w:t>
-      </w:r>
-    </w:p>
-    <w:p>
-      <w:pPr>
-        <w:numPr>
-          <w:ilvl w:val="0"/>
-          <w:numId w:val="1048"/>
-        </w:numPr>
-        <w:pStyle w:val="Compact"/>
-      </w:pPr>
-      <w:r>
-        <w:t xml:space="preserve">synchronised: SIN-kro-nized</w:t>
-      </w:r>
-    </w:p>
-    <w:p>
-      <w:pPr>
-        <w:numPr>
-          <w:ilvl w:val="0"/>
-          <w:numId w:val="1048"/>
-        </w:numPr>
-        <w:pStyle w:val="Compact"/>
-      </w:pPr>
-      <w:r>
-        <w:t xml:space="preserve">teleoperation: tel-ee-op-er-AY-shun</w:t>
-      </w:r>
-    </w:p>
-    <w:p>
-      <w:pPr>
-        <w:numPr>
-          <w:ilvl w:val="0"/>
-          <w:numId w:val="1048"/>
-        </w:numPr>
-        <w:pStyle w:val="Compact"/>
-      </w:pPr>
-      <w:r>
-        <w:t xml:space="preserve">autonomous: aw-TON-o-mus</w:t>
-      </w:r>
-    </w:p>
-    <w:p>
-      <w:pPr>
-        <w:numPr>
-          <w:ilvl w:val="0"/>
-          <w:numId w:val="1048"/>
-        </w:numPr>
-        <w:pStyle w:val="Compact"/>
-      </w:pPr>
-      <w:r>
-        <w:t xml:space="preserve">humanoid: HYOO-ma-noid</w:t>
-      </w:r>
-    </w:p>
-    <w:p>
-      <w:pPr>
-        <w:numPr>
-          <w:ilvl w:val="0"/>
-          <w:numId w:val="1048"/>
-        </w:numPr>
-        <w:pStyle w:val="Compact"/>
-      </w:pPr>
-      <w:r>
-        <w:t xml:space="preserve">esports: EE-sports</w:t>
-      </w:r>
-    </w:p>
-    <w:p>
-      <w:pPr>
-        <w:numPr>
-          <w:ilvl w:val="0"/>
-          <w:numId w:val="1048"/>
-        </w:numPr>
-        <w:pStyle w:val="Compact"/>
-      </w:pPr>
-      <w:r>
-        <w:t xml:space="preserve">motorsport: MO-tor-sport</w:t>
-      </w:r>
-    </w:p>
-    <w:p>
-      <w:pPr>
-        <w:numPr>
-          <w:ilvl w:val="0"/>
-          <w:numId w:val="1048"/>
-        </w:numPr>
-        <w:pStyle w:val="Compact"/>
-      </w:pPr>
-      <w:r>
-        <w:t xml:space="preserve">commentating: COM-men-tay-ting</w:t>
-      </w:r>
-    </w:p>
-    <w:p>
-      <w:pPr>
-        <w:numPr>
-          <w:ilvl w:val="0"/>
-          <w:numId w:val="1048"/>
-        </w:numPr>
-        <w:pStyle w:val="Compact"/>
-      </w:pPr>
-      <w:r>
-        <w:t xml:space="preserve">sceptic: SKEP-tik</w:t>
-      </w:r>
-    </w:p>
-    <w:p>
-      <w:pPr>
-        <w:numPr>
-          <w:ilvl w:val="0"/>
-          <w:numId w:val="1048"/>
-        </w:numPr>
-        <w:pStyle w:val="Compact"/>
-      </w:pPr>
-      <w:r>
-        <w:t xml:space="preserve">novelty: NOV-el-tee</w:t>
-      </w:r>
-    </w:p>
-    <w:p>
-      <w:pPr>
-        <w:numPr>
-          <w:ilvl w:val="0"/>
-          <w:numId w:val="1048"/>
-        </w:numPr>
-        <w:pStyle w:val="Compact"/>
-      </w:pPr>
-      <w:r>
-        <w:t xml:space="preserve">Stockholm: STOCK-holm</w:t>
-      </w:r>
-    </w:p>
-    <w:p>
-      <w:pPr>
-        <w:numPr>
-          <w:ilvl w:val="0"/>
-          <w:numId w:val="1048"/>
-        </w:numPr>
-        <w:pStyle w:val="Compact"/>
-      </w:pPr>
-      <w:r>
-        <w:t xml:space="preserve">Ericsson: ER-ik-son</w:t>
-      </w:r>
-    </w:p>
-    <w:p>
-      <w:pPr>
-        <w:numPr>
-          <w:ilvl w:val="0"/>
-          <w:numId w:val="1048"/>
-        </w:numPr>
-        <w:pStyle w:val="Compact"/>
-      </w:pPr>
-      <w:r>
-        <w:t xml:space="preserve">Nvidia: en-VID-ee-a</w:t>
-      </w:r>
-    </w:p>
-    <w:p>
-      <w:pPr>
-        <w:numPr>
-          <w:ilvl w:val="0"/>
-          <w:numId w:val="1048"/>
-        </w:numPr>
-        <w:pStyle w:val="Compact"/>
-      </w:pPr>
-      <w:r>
-        <w:t xml:space="preserve">Huawei: HWAH-way</w:t>
-      </w:r>
-    </w:p>
-    <w:p>
-      <w:pPr>
-        <w:numPr>
-          <w:ilvl w:val="0"/>
-          <w:numId w:val="1048"/>
-        </w:numPr>
-        <w:pStyle w:val="Compact"/>
-      </w:pPr>
-      <w:r>
-        <w:t xml:space="preserve">SK Hynix: ess-kay HY-niks</w:t>
-      </w:r>
-    </w:p>
-    <w:p>
-      <w:pPr>
-        <w:numPr>
-          <w:ilvl w:val="0"/>
-          <w:numId w:val="1048"/>
-        </w:numPr>
-        <w:pStyle w:val="Compact"/>
-      </w:pPr>
-      <w:r>
-        <w:t xml:space="preserve">Abu Dhabi: AB-oo DAB-ee</w:t>
-      </w:r>
-    </w:p>
-    <w:p>
-      <w:pPr>
-        <w:numPr>
-          <w:ilvl w:val="0"/>
-          <w:numId w:val="1048"/>
-        </w:numPr>
-        <w:pStyle w:val="Compact"/>
-      </w:pPr>
-      <w:r>
-        <w:t xml:space="preserve">Douyin: DOH-yin</w:t>
-      </w:r>
-    </w:p>
-    <w:p>
-      <w:pPr>
-        <w:numPr>
-          <w:ilvl w:val="0"/>
-          <w:numId w:val="1048"/>
-        </w:numPr>
-        <w:pStyle w:val="Compact"/>
-      </w:pPr>
-      <w:r>
-        <w:t xml:space="preserve">Anting: AN-ting</w:t>
-      </w:r>
-    </w:p>
-    <w:p>
-      <w:pPr>
-        <w:numPr>
-          <w:ilvl w:val="0"/>
-          <w:numId w:val="1048"/>
-        </w:numPr>
-        <w:pStyle w:val="Compact"/>
-      </w:pPr>
-      <w:r>
-        <w:t xml:space="preserve">the T-box: TEE-box; the Ro-box: ROH-box</w:t>
-      </w:r>
-    </w:p>
-    <w:p>
-      <w:pPr>
-        <w:numPr>
-          <w:ilvl w:val="0"/>
-          <w:numId w:val="1048"/>
-        </w:numPr>
-        <w:pStyle w:val="Compact"/>
-      </w:pPr>
-      <w:r>
-        <w:t xml:space="preserve">DRAM: DEE-ram</w:t>
-      </w:r>
-    </w:p>
-    <w:p>
-      <w:pPr>
-        <w:numPr>
-          <w:ilvl w:val="0"/>
-          <w:numId w:val="1048"/>
-        </w:numPr>
-        <w:pStyle w:val="Compact"/>
-      </w:pPr>
-      <w:r>
-        <w:t xml:space="preserve">5G-A: five-gee-AY</w:t>
-      </w:r>
-    </w:p>
-    <w:p>
-      <w:pPr>
-        <w:pStyle w:val="FirstParagraph"/>
-      </w:pPr>
-      <w:r>
         <w:t xml:space="preserve">Rhythm rules. Pause at every comma. Land the last word of each sentence; do not let it fall away. Say numbers slowly:</w:t>
       </w:r>
       <w:r>
@@ -14328,11 +14610,11 @@
         <w:t xml:space="preserve">”</w:t>
       </w:r>
       <w:r>
-        <w:t xml:space="preserve">. When a question has two parts, breathe between them.</w:t>
-      </w:r>
-    </w:p>
-    <w:bookmarkEnd w:id="102"/>
-    <w:bookmarkEnd w:id="103"/>
+        <w:t xml:space="preserve">. When a question has two parts, breathe between them. After every question, count one silent second before you move; the silence is where the answer comes from.</w:t>
+      </w:r>
+    </w:p>
+    <w:bookmarkEnd w:id="125"/>
+    <w:bookmarkEnd w:id="126"/>
     <w:sectPr/>
   </w:body>
 </w:document>

</xml_diff>